<commit_message>
Alcance y metodologias terminadas
</commit_message>
<xml_diff>
--- a/Teoria General de Sistemas/PPI/Plantilla PPI Ingeniería Primer Semestre.docx
+++ b/Teoria General de Sistemas/PPI/Plantilla PPI Ingeniería Primer Semestre.docx
@@ -1561,6 +1561,136 @@
                 <w:rFonts w:ascii="Times New Roman" w:hAnsi="Times New Roman" w:cs="Times New Roman"/>
               </w:rPr>
             </w:pPr>
+            <w:r>
+              <w:rPr>
+                <w:rFonts w:ascii="Times New Roman" w:hAnsi="Times New Roman" w:cs="Times New Roman"/>
+              </w:rPr>
+              <w:t>02/03/2026</w:t>
+            </w:r>
+          </w:p>
+        </w:tc>
+        <w:tc>
+          <w:tcPr>
+            <w:tcW w:w="775" w:type="dxa"/>
+            <w:tcBorders>
+              <w:left w:val="single" w:sz="4" w:space="0" w:color="808080"/>
+              <w:bottom w:val="single" w:sz="4" w:space="0" w:color="808080"/>
+            </w:tcBorders>
+            <w:tcMar>
+              <w:top w:w="55" w:type="dxa"/>
+              <w:left w:w="55" w:type="dxa"/>
+              <w:bottom w:w="55" w:type="dxa"/>
+              <w:right w:w="55" w:type="dxa"/>
+            </w:tcMar>
+            <w:vAlign w:val="center"/>
+          </w:tcPr>
+          <w:p>
+            <w:pPr>
+              <w:pStyle w:val="TableContents"/>
+              <w:jc w:val="center"/>
+              <w:rPr>
+                <w:rFonts w:ascii="Times New Roman" w:hAnsi="Times New Roman" w:cs="Times New Roman"/>
+              </w:rPr>
+            </w:pPr>
+            <w:r>
+              <w:rPr>
+                <w:rFonts w:ascii="Times New Roman" w:hAnsi="Times New Roman" w:cs="Times New Roman"/>
+              </w:rPr>
+              <w:t>1.3</w:t>
+            </w:r>
+          </w:p>
+        </w:tc>
+        <w:tc>
+          <w:tcPr>
+            <w:tcW w:w="3525" w:type="dxa"/>
+            <w:tcBorders>
+              <w:left w:val="single" w:sz="4" w:space="0" w:color="808080"/>
+              <w:bottom w:val="single" w:sz="4" w:space="0" w:color="808080"/>
+            </w:tcBorders>
+            <w:tcMar>
+              <w:top w:w="55" w:type="dxa"/>
+              <w:left w:w="55" w:type="dxa"/>
+              <w:bottom w:w="55" w:type="dxa"/>
+              <w:right w:w="55" w:type="dxa"/>
+            </w:tcMar>
+            <w:vAlign w:val="center"/>
+          </w:tcPr>
+          <w:p>
+            <w:pPr>
+              <w:pStyle w:val="TableContents"/>
+              <w:jc w:val="center"/>
+              <w:rPr>
+                <w:rFonts w:ascii="Times New Roman" w:hAnsi="Times New Roman" w:cs="Times New Roman"/>
+              </w:rPr>
+            </w:pPr>
+            <w:r>
+              <w:rPr>
+                <w:rFonts w:ascii="Times New Roman" w:hAnsi="Times New Roman" w:cs="Times New Roman"/>
+              </w:rPr>
+              <w:t>Alcance y metodologías terminadas</w:t>
+            </w:r>
+          </w:p>
+        </w:tc>
+        <w:tc>
+          <w:tcPr>
+            <w:tcW w:w="3004" w:type="dxa"/>
+            <w:tcBorders>
+              <w:left w:val="single" w:sz="4" w:space="0" w:color="808080"/>
+              <w:bottom w:val="single" w:sz="4" w:space="0" w:color="808080"/>
+              <w:right w:val="single" w:sz="4" w:space="0" w:color="808080"/>
+            </w:tcBorders>
+            <w:tcMar>
+              <w:top w:w="55" w:type="dxa"/>
+              <w:left w:w="55" w:type="dxa"/>
+              <w:bottom w:w="55" w:type="dxa"/>
+              <w:right w:w="55" w:type="dxa"/>
+            </w:tcMar>
+            <w:vAlign w:val="center"/>
+          </w:tcPr>
+          <w:p>
+            <w:pPr>
+              <w:pStyle w:val="TableContents"/>
+              <w:jc w:val="center"/>
+              <w:rPr>
+                <w:rFonts w:ascii="Times New Roman" w:hAnsi="Times New Roman" w:cs="Times New Roman"/>
+              </w:rPr>
+            </w:pPr>
+            <w:r>
+              <w:rPr>
+                <w:rFonts w:ascii="Times New Roman" w:hAnsi="Times New Roman" w:cs="Times New Roman"/>
+              </w:rPr>
+              <w:t>Todos</w:t>
+            </w:r>
+          </w:p>
+        </w:tc>
+      </w:tr>
+      <w:tr>
+        <w:trPr>
+          <w:trHeight w:val="313"/>
+        </w:trPr>
+        <w:tc>
+          <w:tcPr>
+            <w:tcW w:w="1040" w:type="dxa"/>
+            <w:tcBorders>
+              <w:left w:val="single" w:sz="4" w:space="0" w:color="808080"/>
+              <w:bottom w:val="single" w:sz="4" w:space="0" w:color="808080"/>
+            </w:tcBorders>
+            <w:tcMar>
+              <w:top w:w="55" w:type="dxa"/>
+              <w:left w:w="55" w:type="dxa"/>
+              <w:bottom w:w="55" w:type="dxa"/>
+              <w:right w:w="55" w:type="dxa"/>
+            </w:tcMar>
+            <w:vAlign w:val="center"/>
+          </w:tcPr>
+          <w:p>
+            <w:pPr>
+              <w:pStyle w:val="TableContents"/>
+              <w:jc w:val="center"/>
+              <w:rPr>
+                <w:rFonts w:ascii="Times New Roman" w:hAnsi="Times New Roman" w:cs="Times New Roman"/>
+              </w:rPr>
+            </w:pPr>
           </w:p>
         </w:tc>
         <w:tc>
@@ -2064,112 +2194,6 @@
           </w:p>
         </w:tc>
       </w:tr>
-      <w:tr>
-        <w:trPr>
-          <w:trHeight w:val="313"/>
-        </w:trPr>
-        <w:tc>
-          <w:tcPr>
-            <w:tcW w:w="1040" w:type="dxa"/>
-            <w:tcBorders>
-              <w:left w:val="single" w:sz="4" w:space="0" w:color="808080"/>
-              <w:bottom w:val="single" w:sz="4" w:space="0" w:color="808080"/>
-            </w:tcBorders>
-            <w:tcMar>
-              <w:top w:w="55" w:type="dxa"/>
-              <w:left w:w="55" w:type="dxa"/>
-              <w:bottom w:w="55" w:type="dxa"/>
-              <w:right w:w="55" w:type="dxa"/>
-            </w:tcMar>
-            <w:vAlign w:val="center"/>
-          </w:tcPr>
-          <w:p>
-            <w:pPr>
-              <w:pStyle w:val="TableContents"/>
-              <w:jc w:val="center"/>
-              <w:rPr>
-                <w:rFonts w:ascii="Times New Roman" w:hAnsi="Times New Roman" w:cs="Times New Roman"/>
-              </w:rPr>
-            </w:pPr>
-          </w:p>
-        </w:tc>
-        <w:tc>
-          <w:tcPr>
-            <w:tcW w:w="775" w:type="dxa"/>
-            <w:tcBorders>
-              <w:left w:val="single" w:sz="4" w:space="0" w:color="808080"/>
-              <w:bottom w:val="single" w:sz="4" w:space="0" w:color="808080"/>
-            </w:tcBorders>
-            <w:tcMar>
-              <w:top w:w="55" w:type="dxa"/>
-              <w:left w:w="55" w:type="dxa"/>
-              <w:bottom w:w="55" w:type="dxa"/>
-              <w:right w:w="55" w:type="dxa"/>
-            </w:tcMar>
-            <w:vAlign w:val="center"/>
-          </w:tcPr>
-          <w:p>
-            <w:pPr>
-              <w:pStyle w:val="TableContents"/>
-              <w:jc w:val="center"/>
-              <w:rPr>
-                <w:rFonts w:ascii="Times New Roman" w:hAnsi="Times New Roman" w:cs="Times New Roman"/>
-              </w:rPr>
-            </w:pPr>
-          </w:p>
-        </w:tc>
-        <w:tc>
-          <w:tcPr>
-            <w:tcW w:w="3525" w:type="dxa"/>
-            <w:tcBorders>
-              <w:left w:val="single" w:sz="4" w:space="0" w:color="808080"/>
-              <w:bottom w:val="single" w:sz="4" w:space="0" w:color="808080"/>
-            </w:tcBorders>
-            <w:tcMar>
-              <w:top w:w="55" w:type="dxa"/>
-              <w:left w:w="55" w:type="dxa"/>
-              <w:bottom w:w="55" w:type="dxa"/>
-              <w:right w:w="55" w:type="dxa"/>
-            </w:tcMar>
-            <w:vAlign w:val="center"/>
-          </w:tcPr>
-          <w:p>
-            <w:pPr>
-              <w:pStyle w:val="TableContents"/>
-              <w:jc w:val="center"/>
-              <w:rPr>
-                <w:rFonts w:ascii="Times New Roman" w:hAnsi="Times New Roman" w:cs="Times New Roman"/>
-              </w:rPr>
-            </w:pPr>
-          </w:p>
-        </w:tc>
-        <w:tc>
-          <w:tcPr>
-            <w:tcW w:w="3004" w:type="dxa"/>
-            <w:tcBorders>
-              <w:left w:val="single" w:sz="4" w:space="0" w:color="808080"/>
-              <w:bottom w:val="single" w:sz="4" w:space="0" w:color="808080"/>
-              <w:right w:val="single" w:sz="4" w:space="0" w:color="808080"/>
-            </w:tcBorders>
-            <w:tcMar>
-              <w:top w:w="55" w:type="dxa"/>
-              <w:left w:w="55" w:type="dxa"/>
-              <w:bottom w:w="55" w:type="dxa"/>
-              <w:right w:w="55" w:type="dxa"/>
-            </w:tcMar>
-            <w:vAlign w:val="center"/>
-          </w:tcPr>
-          <w:p>
-            <w:pPr>
-              <w:pStyle w:val="TableContents"/>
-              <w:jc w:val="center"/>
-              <w:rPr>
-                <w:rFonts w:ascii="Times New Roman" w:hAnsi="Times New Roman" w:cs="Times New Roman"/>
-              </w:rPr>
-            </w:pPr>
-          </w:p>
-        </w:tc>
-      </w:tr>
     </w:tbl>
     <w:p>
       <w:pPr>
@@ -6681,21 +6705,7 @@
             <w:rStyle w:val="Hipervnculo"/>
             <w:rFonts w:ascii="Times New Roman" w:hAnsi="Times New Roman" w:cs="Times New Roman"/>
           </w:rPr>
-          <w:t>cronogram</w:t>
-        </w:r>
-        <w:r>
-          <w:rPr>
-            <w:rStyle w:val="Hipervnculo"/>
-            <w:rFonts w:ascii="Times New Roman" w:hAnsi="Times New Roman" w:cs="Times New Roman"/>
-          </w:rPr>
-          <w:t>a</w:t>
-        </w:r>
-        <w:r>
-          <w:rPr>
-            <w:rStyle w:val="Hipervnculo"/>
-            <w:rFonts w:ascii="Times New Roman" w:hAnsi="Times New Roman" w:cs="Times New Roman"/>
-          </w:rPr>
-          <w:t>.xlsx</w:t>
+          <w:t>cronograma.xlsx</w:t>
         </w:r>
       </w:hyperlink>
     </w:p>
@@ -6712,7 +6722,7 @@
         <w:pStyle w:val="Textbody"/>
         <w:rPr>
           <w:rFonts w:ascii="Times New Roman" w:hAnsi="Times New Roman" w:cs="Times New Roman"/>
-          <w:lang w:val="en-US"/>
+          <w:lang w:val="es-CO"/>
         </w:rPr>
       </w:pPr>
       <w:r>
@@ -7518,6 +7528,121 @@
         <w:rPr>
           <w:rFonts w:ascii="Times New Roman" w:hAnsi="Times New Roman" w:cs="Times New Roman"/>
         </w:rPr>
+        <w:t>Alcance:</w:t>
+      </w:r>
+    </w:p>
+    <w:p>
+      <w:pPr>
+        <w:pStyle w:val="Textbody"/>
+      </w:pPr>
+      <w:r>
+        <w:t xml:space="preserve">El alcance que </w:t>
+      </w:r>
+      <w:r>
+        <w:t xml:space="preserve">se tiene pensado </w:t>
+      </w:r>
+      <w:r>
+        <w:t>para el proyecto “</w:t>
+      </w:r>
+      <w:r>
+        <w:rPr>
+          <w:b/>
+          <w:bCs/>
+        </w:rPr>
+        <w:t xml:space="preserve">Software para Optimización Operacional Next </w:t>
+      </w:r>
+      <w:proofErr w:type="spellStart"/>
+      <w:r>
+        <w:rPr>
+          <w:b/>
+          <w:bCs/>
+        </w:rPr>
+        <w:t>Level</w:t>
+      </w:r>
+      <w:proofErr w:type="spellEnd"/>
+      <w:r>
+        <w:t xml:space="preserve">” se centrara en el desarrollo e implementación de un sistema de agenda y gestión llamado </w:t>
+      </w:r>
+      <w:proofErr w:type="spellStart"/>
+      <w:r>
+        <w:rPr>
+          <w:b/>
+          <w:bCs/>
+        </w:rPr>
+        <w:t>Level</w:t>
+      </w:r>
+      <w:proofErr w:type="spellEnd"/>
+      <w:r>
+        <w:rPr>
+          <w:b/>
+          <w:bCs/>
+        </w:rPr>
+        <w:t xml:space="preserve"> </w:t>
+      </w:r>
+      <w:proofErr w:type="spellStart"/>
+      <w:r>
+        <w:rPr>
+          <w:b/>
+          <w:bCs/>
+        </w:rPr>
+        <w:t>OptiZone</w:t>
+      </w:r>
+      <w:proofErr w:type="spellEnd"/>
+      <w:r>
+        <w:rPr>
+          <w:b/>
+          <w:bCs/>
+        </w:rPr>
+        <w:t xml:space="preserve"> TDEA</w:t>
+      </w:r>
+      <w:r>
+        <w:t xml:space="preserve">, el cual busca mejorar la organización y funcionamiento del laboratorio de videojuegos </w:t>
+      </w:r>
+      <w:proofErr w:type="spellStart"/>
+      <w:r>
+        <w:rPr>
+          <w:b/>
+          <w:bCs/>
+        </w:rPr>
+        <w:t>NextLeve</w:t>
+      </w:r>
+      <w:r>
+        <w:t>l</w:t>
+      </w:r>
+      <w:proofErr w:type="spellEnd"/>
+      <w:r>
+        <w:t xml:space="preserve"> del Tecnológico de Antioquia.  El producto final será un sistema que permita gestionar reservas, controlar el tiempo de uso de los espacios y equipos, organizar horarios y registrar actividades, además de generar reportes estadísticos sobre el uso del laboratorio.  El sistema incluirá el diseño de una interfaz UI y UX intuitiva y accesible, una arquitectura organizada que facilite su funcionamiento y futuras mejoras, la implementación de funciones principales para pruebas de funcionamiento (</w:t>
+      </w:r>
+      <w:proofErr w:type="spellStart"/>
+      <w:r>
+        <w:t>testing</w:t>
+      </w:r>
+      <w:proofErr w:type="spellEnd"/>
+      <w:r>
+        <w:t>), el sistema se verá orientado a facilitar la coordinación del personal administrativo, el seguimiento de tareas, la calidad del proyecto</w:t>
+      </w:r>
+      <w:r>
+        <w:t>, análisis de resultados y mejoramientos</w:t>
+      </w:r>
+      <w:r>
+        <w:t xml:space="preserve"> y la aplicación de metodologías ágiles que permitan una correcta planificación y desarrollo del proyecto.</w:t>
+      </w:r>
+    </w:p>
+    <w:p>
+      <w:pPr>
+        <w:pStyle w:val="Ttulo2"/>
+        <w:numPr>
+          <w:ilvl w:val="1"/>
+          <w:numId w:val="0"/>
+        </w:numPr>
+        <w:rPr>
+          <w:rFonts w:ascii="Times New Roman" w:hAnsi="Times New Roman" w:cs="Times New Roman"/>
+        </w:rPr>
+      </w:pPr>
+      <w:r>
+        <w:rPr>
+          <w:rFonts w:ascii="Times New Roman" w:hAnsi="Times New Roman" w:cs="Times New Roman"/>
+        </w:rPr>
         <w:t xml:space="preserve">2.4. </w:t>
       </w:r>
       <w:r>
@@ -7527,6 +7652,363 @@
         <w:t>Metodología.</w:t>
       </w:r>
       <w:bookmarkEnd w:id="19"/>
+    </w:p>
+    <w:p>
+      <w:pPr>
+        <w:widowControl/>
+        <w:suppressAutoHyphens w:val="0"/>
+        <w:autoSpaceDN/>
+        <w:textAlignment w:val="auto"/>
+        <w:rPr>
+          <w:rFonts w:cs="Times New Roman"/>
+        </w:rPr>
+      </w:pPr>
+      <w:r>
+        <w:rPr>
+          <w:rFonts w:ascii="NewsGotT" w:hAnsi="NewsGotT"/>
+          <w:sz w:val="22"/>
+        </w:rPr>
+        <w:t>Este ítem se describen las actividades que se deben realizar para cumplir con los objetivos específicos formulados. La metodología constituye la guía que orienta al equipo de trabajo sobre el paso a paso para obtener el producto final definido en el proyecto</w:t>
+      </w:r>
+      <w:r>
+        <w:rPr>
+          <w:rFonts w:cs="Times New Roman"/>
+        </w:rPr>
+        <w:t>.</w:t>
+      </w:r>
+    </w:p>
+    <w:p>
+      <w:pPr>
+        <w:widowControl/>
+        <w:suppressAutoHyphens w:val="0"/>
+        <w:autoSpaceDN/>
+        <w:textAlignment w:val="auto"/>
+        <w:rPr>
+          <w:rFonts w:cs="Times New Roman"/>
+        </w:rPr>
+      </w:pPr>
+    </w:p>
+    <w:p>
+      <w:pPr>
+        <w:widowControl/>
+        <w:suppressAutoHyphens w:val="0"/>
+        <w:autoSpaceDN/>
+        <w:textAlignment w:val="auto"/>
+        <w:rPr>
+          <w:rFonts w:eastAsia="MS Mincho" w:cs="Times New Roman"/>
+          <w:b/>
+          <w:bCs/>
+          <w:i/>
+          <w:iCs/>
+          <w:sz w:val="28"/>
+          <w:szCs w:val="28"/>
+        </w:rPr>
+      </w:pPr>
+      <w:r>
+        <w:rPr>
+          <w:rFonts w:eastAsia="MS Mincho" w:cs="Times New Roman"/>
+          <w:b/>
+          <w:bCs/>
+          <w:i/>
+          <w:iCs/>
+          <w:sz w:val="28"/>
+          <w:szCs w:val="28"/>
+        </w:rPr>
+        <w:t>Metodología.</w:t>
+      </w:r>
+    </w:p>
+    <w:p>
+      <w:pPr>
+        <w:widowControl/>
+        <w:suppressAutoHyphens w:val="0"/>
+        <w:autoSpaceDN/>
+        <w:textAlignment w:val="auto"/>
+        <w:rPr>
+          <w:rFonts w:eastAsia="MS Mincho" w:cs="Times New Roman"/>
+          <w:b/>
+          <w:bCs/>
+          <w:i/>
+          <w:iCs/>
+          <w:sz w:val="28"/>
+          <w:szCs w:val="28"/>
+        </w:rPr>
+      </w:pPr>
+    </w:p>
+    <w:p>
+      <w:pPr>
+        <w:widowControl/>
+        <w:suppressAutoHyphens w:val="0"/>
+        <w:autoSpaceDN/>
+        <w:textAlignment w:val="auto"/>
+        <w:rPr>
+          <w:rFonts w:ascii="NewsGotT" w:hAnsi="NewsGotT"/>
+          <w:sz w:val="22"/>
+        </w:rPr>
+      </w:pPr>
+      <w:r>
+        <w:rPr>
+          <w:rFonts w:ascii="NewsGotT" w:hAnsi="NewsGotT"/>
+          <w:sz w:val="22"/>
+        </w:rPr>
+        <w:t>La metodología pensada para el software / página web “</w:t>
+      </w:r>
+      <w:proofErr w:type="spellStart"/>
+      <w:r>
+        <w:rPr>
+          <w:rFonts w:ascii="NewsGotT" w:hAnsi="NewsGotT"/>
+          <w:sz w:val="22"/>
+        </w:rPr>
+        <w:t>Level</w:t>
+      </w:r>
+      <w:proofErr w:type="spellEnd"/>
+      <w:r>
+        <w:rPr>
+          <w:rFonts w:ascii="NewsGotT" w:hAnsi="NewsGotT"/>
+          <w:sz w:val="22"/>
+        </w:rPr>
+        <w:t xml:space="preserve"> </w:t>
+      </w:r>
+      <w:proofErr w:type="spellStart"/>
+      <w:r>
+        <w:rPr>
+          <w:rFonts w:ascii="NewsGotT" w:hAnsi="NewsGotT"/>
+          <w:sz w:val="22"/>
+        </w:rPr>
+        <w:t>Optizone</w:t>
+      </w:r>
+      <w:proofErr w:type="spellEnd"/>
+      <w:r>
+        <w:rPr>
+          <w:rFonts w:ascii="NewsGotT" w:hAnsi="NewsGotT"/>
+          <w:sz w:val="22"/>
+        </w:rPr>
+        <w:t xml:space="preserve"> </w:t>
+      </w:r>
+      <w:proofErr w:type="spellStart"/>
+      <w:r>
+        <w:rPr>
+          <w:rFonts w:ascii="NewsGotT" w:hAnsi="NewsGotT"/>
+          <w:sz w:val="22"/>
+        </w:rPr>
+        <w:t>TdeA</w:t>
+      </w:r>
+      <w:proofErr w:type="spellEnd"/>
+      <w:r>
+        <w:rPr>
+          <w:rFonts w:ascii="NewsGotT" w:hAnsi="NewsGotT"/>
+          <w:sz w:val="22"/>
+        </w:rPr>
+        <w:t xml:space="preserve">” para la gestión y sistema de reservas del laboratorio de juegos Next </w:t>
+      </w:r>
+      <w:proofErr w:type="spellStart"/>
+      <w:r>
+        <w:rPr>
+          <w:rFonts w:ascii="NewsGotT" w:hAnsi="NewsGotT"/>
+          <w:sz w:val="22"/>
+        </w:rPr>
+        <w:t>Level</w:t>
+      </w:r>
+      <w:proofErr w:type="spellEnd"/>
+      <w:r>
+        <w:rPr>
+          <w:rFonts w:ascii="NewsGotT" w:hAnsi="NewsGotT"/>
+          <w:sz w:val="22"/>
+        </w:rPr>
+        <w:t xml:space="preserve"> del Tecnológico de Antioquia está compuesta de la siguiente manera:</w:t>
+      </w:r>
+    </w:p>
+    <w:p>
+      <w:pPr>
+        <w:widowControl/>
+        <w:suppressAutoHyphens w:val="0"/>
+        <w:autoSpaceDN/>
+        <w:textAlignment w:val="auto"/>
+        <w:rPr>
+          <w:rFonts w:ascii="NewsGotT" w:hAnsi="NewsGotT"/>
+          <w:sz w:val="22"/>
+        </w:rPr>
+      </w:pPr>
+      <w:r>
+        <w:rPr>
+          <w:rFonts w:ascii="NewsGotT" w:hAnsi="NewsGotT"/>
+          <w:b/>
+          <w:bCs/>
+          <w:sz w:val="22"/>
+        </w:rPr>
+        <w:t>Entendimiento y Planificación:</w:t>
+      </w:r>
+      <w:r>
+        <w:rPr>
+          <w:rFonts w:ascii="NewsGotT" w:hAnsi="NewsGotT"/>
+          <w:sz w:val="22"/>
+        </w:rPr>
+        <w:t xml:space="preserve"> Comprender el funcionamiento y la posición de la iniciativa, sus necesidades y las de los estudiantes y directivos, para con esto trazar un plan de acción con objetivos, funcionalidades, alcances y etapas a conseguir para el producto final.</w:t>
+      </w:r>
+    </w:p>
+    <w:p>
+      <w:pPr>
+        <w:widowControl/>
+        <w:suppressAutoHyphens w:val="0"/>
+        <w:autoSpaceDN/>
+        <w:textAlignment w:val="auto"/>
+        <w:rPr>
+          <w:rFonts w:ascii="NewsGotT" w:hAnsi="NewsGotT"/>
+          <w:sz w:val="22"/>
+        </w:rPr>
+      </w:pPr>
+      <w:r>
+        <w:rPr>
+          <w:rFonts w:ascii="NewsGotT" w:hAnsi="NewsGotT"/>
+          <w:b/>
+          <w:bCs/>
+          <w:sz w:val="22"/>
+        </w:rPr>
+        <w:t>Arquitectura y Desarrollo:</w:t>
+      </w:r>
+      <w:r>
+        <w:rPr>
+          <w:rFonts w:ascii="NewsGotT" w:hAnsi="NewsGotT"/>
+          <w:sz w:val="22"/>
+        </w:rPr>
+        <w:t xml:space="preserve"> Diseño y planificación UI con mockups que permitan prototipos visuales de la página, arquitectura de funcionalidades y modelos en Java para el uso de su funcionalidad</w:t>
+      </w:r>
+      <w:r>
+        <w:rPr>
+          <w:rFonts w:ascii="NewsGotT" w:hAnsi="NewsGotT"/>
+          <w:sz w:val="22"/>
+        </w:rPr>
+        <w:t xml:space="preserve"> y modelo UX</w:t>
+      </w:r>
+      <w:r>
+        <w:rPr>
+          <w:rFonts w:ascii="NewsGotT" w:hAnsi="NewsGotT"/>
+          <w:sz w:val="22"/>
+        </w:rPr>
+        <w:t xml:space="preserve">; finalmente, construcción de la página web con herramientas como (HTML, CSS, JavaScript) </w:t>
+      </w:r>
+      <w:r>
+        <w:rPr>
+          <w:rFonts w:ascii="NewsGotT" w:hAnsi="NewsGotT"/>
+          <w:sz w:val="22"/>
+        </w:rPr>
+        <w:lastRenderedPageBreak/>
+        <w:t xml:space="preserve">y </w:t>
+      </w:r>
+      <w:proofErr w:type="spellStart"/>
+      <w:r>
+        <w:rPr>
+          <w:rFonts w:ascii="NewsGotT" w:hAnsi="NewsGotT"/>
+          <w:sz w:val="22"/>
+        </w:rPr>
+        <w:t>frameworks</w:t>
+      </w:r>
+      <w:proofErr w:type="spellEnd"/>
+      <w:r>
+        <w:rPr>
+          <w:rFonts w:ascii="NewsGotT" w:hAnsi="NewsGotT"/>
+          <w:sz w:val="22"/>
+        </w:rPr>
+        <w:t xml:space="preserve"> afines, y su integración con posibles </w:t>
+      </w:r>
+      <w:proofErr w:type="spellStart"/>
+      <w:r>
+        <w:rPr>
+          <w:rFonts w:ascii="NewsGotT" w:hAnsi="NewsGotT"/>
+          <w:sz w:val="22"/>
+        </w:rPr>
+        <w:t>APIs</w:t>
+      </w:r>
+      <w:proofErr w:type="spellEnd"/>
+      <w:r>
+        <w:rPr>
+          <w:rFonts w:ascii="NewsGotT" w:hAnsi="NewsGotT"/>
+          <w:sz w:val="22"/>
+        </w:rPr>
+        <w:t>, bases de datos y conjunción con la plataforma institucional.</w:t>
+      </w:r>
+    </w:p>
+    <w:p>
+      <w:pPr>
+        <w:widowControl/>
+        <w:suppressAutoHyphens w:val="0"/>
+        <w:autoSpaceDN/>
+        <w:textAlignment w:val="auto"/>
+        <w:rPr>
+          <w:rFonts w:ascii="NewsGotT" w:hAnsi="NewsGotT"/>
+          <w:sz w:val="22"/>
+        </w:rPr>
+      </w:pPr>
+      <w:proofErr w:type="spellStart"/>
+      <w:r>
+        <w:rPr>
+          <w:rFonts w:ascii="NewsGotT" w:hAnsi="NewsGotT"/>
+          <w:b/>
+          <w:bCs/>
+          <w:sz w:val="22"/>
+        </w:rPr>
+        <w:t>Testing</w:t>
+      </w:r>
+      <w:proofErr w:type="spellEnd"/>
+      <w:r>
+        <w:rPr>
+          <w:rFonts w:ascii="NewsGotT" w:hAnsi="NewsGotT"/>
+          <w:b/>
+          <w:bCs/>
+          <w:sz w:val="22"/>
+        </w:rPr>
+        <w:t xml:space="preserve"> y Arreglos:</w:t>
+      </w:r>
+      <w:r>
+        <w:rPr>
+          <w:rFonts w:ascii="NewsGotT" w:hAnsi="NewsGotT"/>
+          <w:sz w:val="22"/>
+        </w:rPr>
+        <w:t xml:space="preserve"> Verificar, por medio de etapas de </w:t>
+      </w:r>
+      <w:proofErr w:type="spellStart"/>
+      <w:r>
+        <w:rPr>
+          <w:rFonts w:ascii="NewsGotT" w:hAnsi="NewsGotT"/>
+          <w:sz w:val="22"/>
+        </w:rPr>
+        <w:t>testing</w:t>
+      </w:r>
+      <w:proofErr w:type="spellEnd"/>
+      <w:r>
+        <w:rPr>
+          <w:rFonts w:ascii="NewsGotT" w:hAnsi="NewsGotT"/>
+          <w:sz w:val="22"/>
+        </w:rPr>
+        <w:t>, que el funcionamiento de todas las capas sea correcto y, en caso de bugs o cambios, aplicar una etapa de manejo de errores.</w:t>
+      </w:r>
+    </w:p>
+    <w:p>
+      <w:pPr>
+        <w:widowControl/>
+        <w:suppressAutoHyphens w:val="0"/>
+        <w:autoSpaceDN/>
+        <w:textAlignment w:val="auto"/>
+        <w:rPr>
+          <w:rFonts w:ascii="NewsGotT" w:hAnsi="NewsGotT"/>
+          <w:sz w:val="22"/>
+        </w:rPr>
+      </w:pPr>
+      <w:r>
+        <w:rPr>
+          <w:rFonts w:ascii="NewsGotT" w:hAnsi="NewsGotT"/>
+          <w:b/>
+          <w:bCs/>
+          <w:sz w:val="22"/>
+        </w:rPr>
+        <w:t>Producción y Promoción:</w:t>
+      </w:r>
+      <w:r>
+        <w:rPr>
+          <w:rFonts w:ascii="NewsGotT" w:hAnsi="NewsGotT"/>
+          <w:sz w:val="22"/>
+        </w:rPr>
+        <w:t xml:space="preserve"> Lanzar el aplicativo a etapa de producción, donde tenga contacto con usuarios reales, y promocionar la página como principal fuente de información sobre la iniciativa y eventos.</w:t>
+      </w:r>
     </w:p>
     <w:p>
       <w:pPr>
@@ -7540,14 +8022,9 @@
           <w:bCs/>
           <w:sz w:val="28"/>
           <w:szCs w:val="28"/>
-        </w:rPr>
-      </w:pPr>
-      <w:r>
-        <w:rPr>
-          <w:rFonts w:cs="Times New Roman"/>
-        </w:rPr>
-        <w:t>Este ítem se describen las actividades que se deben realizar para cumplir con los objetivos específicos formulados. La metodología constituye la guía que orienta al equipo de trabajo sobre el paso a paso para obtener el producto final definido en el proyecto.</w:t>
-      </w:r>
+          <w:u w:val="single"/>
+        </w:rPr>
+      </w:pPr>
       <w:r>
         <w:rPr>
           <w:rFonts w:cs="Times New Roman"/>
@@ -9209,6 +9686,155 @@
     </w:lvl>
   </w:abstractNum>
   <w:abstractNum w:abstractNumId="4" w15:restartNumberingAfterBreak="0">
+    <w:nsid w:val="48BD4B76"/>
+    <w:multiLevelType w:val="multilevel"/>
+    <w:tmpl w:val="6C8230A6"/>
+    <w:lvl w:ilvl="0">
+      <w:start w:val="1"/>
+      <w:numFmt w:val="bullet"/>
+      <w:lvlText w:val=""/>
+      <w:lvlJc w:val="left"/>
+      <w:pPr>
+        <w:tabs>
+          <w:tab w:val="num" w:pos="720"/>
+        </w:tabs>
+        <w:ind w:left="720" w:hanging="360"/>
+      </w:pPr>
+      <w:rPr>
+        <w:rFonts w:ascii="Symbol" w:hAnsi="Symbol" w:hint="default"/>
+        <w:sz w:val="20"/>
+      </w:rPr>
+    </w:lvl>
+    <w:lvl w:ilvl="1" w:tentative="1">
+      <w:start w:val="1"/>
+      <w:numFmt w:val="bullet"/>
+      <w:lvlText w:val="o"/>
+      <w:lvlJc w:val="left"/>
+      <w:pPr>
+        <w:tabs>
+          <w:tab w:val="num" w:pos="1440"/>
+        </w:tabs>
+        <w:ind w:left="1440" w:hanging="360"/>
+      </w:pPr>
+      <w:rPr>
+        <w:rFonts w:ascii="Courier New" w:hAnsi="Courier New" w:hint="default"/>
+        <w:sz w:val="20"/>
+      </w:rPr>
+    </w:lvl>
+    <w:lvl w:ilvl="2" w:tentative="1">
+      <w:start w:val="1"/>
+      <w:numFmt w:val="bullet"/>
+      <w:lvlText w:val=""/>
+      <w:lvlJc w:val="left"/>
+      <w:pPr>
+        <w:tabs>
+          <w:tab w:val="num" w:pos="2160"/>
+        </w:tabs>
+        <w:ind w:left="2160" w:hanging="360"/>
+      </w:pPr>
+      <w:rPr>
+        <w:rFonts w:ascii="Wingdings" w:hAnsi="Wingdings" w:hint="default"/>
+        <w:sz w:val="20"/>
+      </w:rPr>
+    </w:lvl>
+    <w:lvl w:ilvl="3" w:tentative="1">
+      <w:start w:val="1"/>
+      <w:numFmt w:val="bullet"/>
+      <w:lvlText w:val=""/>
+      <w:lvlJc w:val="left"/>
+      <w:pPr>
+        <w:tabs>
+          <w:tab w:val="num" w:pos="2880"/>
+        </w:tabs>
+        <w:ind w:left="2880" w:hanging="360"/>
+      </w:pPr>
+      <w:rPr>
+        <w:rFonts w:ascii="Wingdings" w:hAnsi="Wingdings" w:hint="default"/>
+        <w:sz w:val="20"/>
+      </w:rPr>
+    </w:lvl>
+    <w:lvl w:ilvl="4" w:tentative="1">
+      <w:start w:val="1"/>
+      <w:numFmt w:val="bullet"/>
+      <w:lvlText w:val=""/>
+      <w:lvlJc w:val="left"/>
+      <w:pPr>
+        <w:tabs>
+          <w:tab w:val="num" w:pos="3600"/>
+        </w:tabs>
+        <w:ind w:left="3600" w:hanging="360"/>
+      </w:pPr>
+      <w:rPr>
+        <w:rFonts w:ascii="Wingdings" w:hAnsi="Wingdings" w:hint="default"/>
+        <w:sz w:val="20"/>
+      </w:rPr>
+    </w:lvl>
+    <w:lvl w:ilvl="5" w:tentative="1">
+      <w:start w:val="1"/>
+      <w:numFmt w:val="bullet"/>
+      <w:lvlText w:val=""/>
+      <w:lvlJc w:val="left"/>
+      <w:pPr>
+        <w:tabs>
+          <w:tab w:val="num" w:pos="4320"/>
+        </w:tabs>
+        <w:ind w:left="4320" w:hanging="360"/>
+      </w:pPr>
+      <w:rPr>
+        <w:rFonts w:ascii="Wingdings" w:hAnsi="Wingdings" w:hint="default"/>
+        <w:sz w:val="20"/>
+      </w:rPr>
+    </w:lvl>
+    <w:lvl w:ilvl="6" w:tentative="1">
+      <w:start w:val="1"/>
+      <w:numFmt w:val="bullet"/>
+      <w:lvlText w:val=""/>
+      <w:lvlJc w:val="left"/>
+      <w:pPr>
+        <w:tabs>
+          <w:tab w:val="num" w:pos="5040"/>
+        </w:tabs>
+        <w:ind w:left="5040" w:hanging="360"/>
+      </w:pPr>
+      <w:rPr>
+        <w:rFonts w:ascii="Wingdings" w:hAnsi="Wingdings" w:hint="default"/>
+        <w:sz w:val="20"/>
+      </w:rPr>
+    </w:lvl>
+    <w:lvl w:ilvl="7" w:tentative="1">
+      <w:start w:val="1"/>
+      <w:numFmt w:val="bullet"/>
+      <w:lvlText w:val=""/>
+      <w:lvlJc w:val="left"/>
+      <w:pPr>
+        <w:tabs>
+          <w:tab w:val="num" w:pos="5760"/>
+        </w:tabs>
+        <w:ind w:left="5760" w:hanging="360"/>
+      </w:pPr>
+      <w:rPr>
+        <w:rFonts w:ascii="Wingdings" w:hAnsi="Wingdings" w:hint="default"/>
+        <w:sz w:val="20"/>
+      </w:rPr>
+    </w:lvl>
+    <w:lvl w:ilvl="8" w:tentative="1">
+      <w:start w:val="1"/>
+      <w:numFmt w:val="bullet"/>
+      <w:lvlText w:val=""/>
+      <w:lvlJc w:val="left"/>
+      <w:pPr>
+        <w:tabs>
+          <w:tab w:val="num" w:pos="6480"/>
+        </w:tabs>
+        <w:ind w:left="6480" w:hanging="360"/>
+      </w:pPr>
+      <w:rPr>
+        <w:rFonts w:ascii="Wingdings" w:hAnsi="Wingdings" w:hint="default"/>
+        <w:sz w:val="20"/>
+      </w:rPr>
+    </w:lvl>
+  </w:abstractNum>
+  <w:abstractNum w:abstractNumId="5" w15:restartNumberingAfterBreak="0">
     <w:nsid w:val="4B990033"/>
     <w:multiLevelType w:val="multilevel"/>
     <w:tmpl w:val="8BD62216"/>
@@ -9300,7 +9926,7 @@
       </w:pPr>
     </w:lvl>
   </w:abstractNum>
-  <w:abstractNum w:abstractNumId="5" w15:restartNumberingAfterBreak="0">
+  <w:abstractNum w:abstractNumId="6" w15:restartNumberingAfterBreak="0">
     <w:nsid w:val="4BEE3111"/>
     <w:multiLevelType w:val="hybridMultilevel"/>
     <w:tmpl w:val="250A5A50"/>
@@ -9413,7 +10039,7 @@
       </w:rPr>
     </w:lvl>
   </w:abstractNum>
-  <w:abstractNum w:abstractNumId="6" w15:restartNumberingAfterBreak="0">
+  <w:abstractNum w:abstractNumId="7" w15:restartNumberingAfterBreak="0">
     <w:nsid w:val="4FE6039D"/>
     <w:multiLevelType w:val="multilevel"/>
     <w:tmpl w:val="91B09CB8"/>
@@ -9517,7 +10143,7 @@
       </w:rPr>
     </w:lvl>
   </w:abstractNum>
-  <w:abstractNum w:abstractNumId="7" w15:restartNumberingAfterBreak="0">
+  <w:abstractNum w:abstractNumId="8" w15:restartNumberingAfterBreak="0">
     <w:nsid w:val="67310AB2"/>
     <w:multiLevelType w:val="hybridMultilevel"/>
     <w:tmpl w:val="A78AE5C6"/>
@@ -9629,7 +10255,7 @@
       </w:rPr>
     </w:lvl>
   </w:abstractNum>
-  <w:abstractNum w:abstractNumId="8" w15:restartNumberingAfterBreak="0">
+  <w:abstractNum w:abstractNumId="9" w15:restartNumberingAfterBreak="0">
     <w:nsid w:val="6AA752EA"/>
     <w:multiLevelType w:val="multilevel"/>
     <w:tmpl w:val="5080AE76"/>
@@ -9706,7 +10332,7 @@
       </w:rPr>
     </w:lvl>
   </w:abstractNum>
-  <w:abstractNum w:abstractNumId="9" w15:restartNumberingAfterBreak="0">
+  <w:abstractNum w:abstractNumId="10" w15:restartNumberingAfterBreak="0">
     <w:nsid w:val="7AA00E0A"/>
     <w:multiLevelType w:val="hybridMultilevel"/>
     <w:tmpl w:val="ACCED1F2"/>
@@ -9799,7 +10425,7 @@
     </w:lvl>
   </w:abstractNum>
   <w:num w:numId="1">
-    <w:abstractNumId w:val="4"/>
+    <w:abstractNumId w:val="5"/>
   </w:num>
   <w:num w:numId="2">
     <w:abstractNumId w:val="3"/>
@@ -9865,10 +10491,10 @@
     </w:lvlOverride>
   </w:num>
   <w:num w:numId="14">
-    <w:abstractNumId w:val="8"/>
+    <w:abstractNumId w:val="9"/>
   </w:num>
   <w:num w:numId="15">
-    <w:abstractNumId w:val="8"/>
+    <w:abstractNumId w:val="9"/>
     <w:lvlOverride w:ilvl="0">
       <w:startOverride w:val="1"/>
     </w:lvlOverride>
@@ -9916,28 +10542,31 @@
     </w:lvlOverride>
   </w:num>
   <w:num w:numId="23">
-    <w:abstractNumId w:val="6"/>
+    <w:abstractNumId w:val="7"/>
   </w:num>
   <w:num w:numId="24">
-    <w:abstractNumId w:val="4"/>
+    <w:abstractNumId w:val="5"/>
   </w:num>
   <w:num w:numId="25">
-    <w:abstractNumId w:val="9"/>
+    <w:abstractNumId w:val="10"/>
   </w:num>
   <w:num w:numId="26">
-    <w:abstractNumId w:val="4"/>
+    <w:abstractNumId w:val="5"/>
   </w:num>
   <w:num w:numId="27">
-    <w:abstractNumId w:val="4"/>
+    <w:abstractNumId w:val="5"/>
   </w:num>
   <w:num w:numId="28">
     <w:abstractNumId w:val="0"/>
   </w:num>
   <w:num w:numId="29">
-    <w:abstractNumId w:val="5"/>
+    <w:abstractNumId w:val="6"/>
   </w:num>
   <w:num w:numId="30">
-    <w:abstractNumId w:val="7"/>
+    <w:abstractNumId w:val="8"/>
+  </w:num>
+  <w:num w:numId="31">
+    <w:abstractNumId w:val="4"/>
   </w:num>
 </w:numbering>
 </file>
@@ -11002,6 +11631,17 @@
       <w:u w:val="single"/>
     </w:rPr>
   </w:style>
+  <w:style w:type="paragraph" w:styleId="Prrafodelista">
+    <w:name w:val="List Paragraph"/>
+    <w:basedOn w:val="Normal"/>
+    <w:uiPriority w:val="34"/>
+    <w:qFormat/>
+    <w:rsid w:val="006176BE"/>
+    <w:pPr>
+      <w:ind w:left="720"/>
+      <w:contextualSpacing/>
+    </w:pPr>
+  </w:style>
 </w:styles>
 </file>
 

</xml_diff>

<commit_message>
indices y trabajos añadidos
</commit_message>
<xml_diff>
--- a/Teoria General de Sistemas/PPI/Plantilla PPI Ingeniería Primer Semestre.docx
+++ b/Teoria General de Sistemas/PPI/Plantilla PPI Ingeniería Primer Semestre.docx
@@ -1951,6 +1951,12 @@
                 <w:rFonts w:ascii="Times New Roman" w:hAnsi="Times New Roman" w:cs="Times New Roman"/>
               </w:rPr>
             </w:pPr>
+            <w:r>
+              <w:rPr>
+                <w:rFonts w:ascii="Times New Roman" w:hAnsi="Times New Roman" w:cs="Times New Roman"/>
+              </w:rPr>
+              <w:t>22/03/2026</w:t>
+            </w:r>
           </w:p>
         </w:tc>
         <w:tc>
@@ -1976,6 +1982,12 @@
                 <w:rFonts w:ascii="Times New Roman" w:hAnsi="Times New Roman" w:cs="Times New Roman"/>
               </w:rPr>
             </w:pPr>
+            <w:r>
+              <w:rPr>
+                <w:rFonts w:ascii="Times New Roman" w:hAnsi="Times New Roman" w:cs="Times New Roman"/>
+              </w:rPr>
+              <w:t>1.6</w:t>
+            </w:r>
           </w:p>
         </w:tc>
         <w:tc>
@@ -2001,6 +2013,12 @@
                 <w:rFonts w:ascii="Times New Roman" w:hAnsi="Times New Roman" w:cs="Times New Roman"/>
               </w:rPr>
             </w:pPr>
+            <w:r>
+              <w:rPr>
+                <w:rFonts w:ascii="Times New Roman" w:hAnsi="Times New Roman" w:cs="Times New Roman"/>
+              </w:rPr>
+              <w:t>Primera versión punto 3.4</w:t>
+            </w:r>
           </w:p>
         </w:tc>
         <w:tc>
@@ -2027,6 +2045,12 @@
                 <w:rFonts w:ascii="Times New Roman" w:hAnsi="Times New Roman" w:cs="Times New Roman"/>
               </w:rPr>
             </w:pPr>
+            <w:r>
+              <w:rPr>
+                <w:rFonts w:ascii="Times New Roman" w:hAnsi="Times New Roman" w:cs="Times New Roman"/>
+              </w:rPr>
+              <w:t>David</w:t>
+            </w:r>
           </w:p>
         </w:tc>
       </w:tr>
@@ -5333,6 +5357,17 @@
           <w:lang w:val="es-CO"/>
         </w:rPr>
       </w:pPr>
+    </w:p>
+    <w:p>
+      <w:pPr>
+        <w:pStyle w:val="Textbody"/>
+        <w:rPr>
+          <w:rFonts w:ascii="Times New Roman" w:eastAsia="Times New Roman" w:hAnsi="Times New Roman" w:cs="Times New Roman"/>
+          <w:kern w:val="0"/>
+          <w:szCs w:val="22"/>
+          <w:lang w:val="es-CO"/>
+        </w:rPr>
+      </w:pPr>
       <w:r>
         <w:rPr>
           <w:rFonts w:ascii="Times New Roman" w:eastAsia="Times New Roman" w:hAnsi="Times New Roman" w:cs="Times New Roman"/>
@@ -5384,48 +5419,17 @@
           <w:szCs w:val="22"/>
           <w:lang w:val="es-CO"/>
         </w:rPr>
-        <w:t xml:space="preserve">El </w:t>
-      </w:r>
-      <w:r>
-        <w:rPr>
-          <w:rFonts w:ascii="Times New Roman" w:eastAsia="Times New Roman" w:hAnsi="Times New Roman" w:cs="Times New Roman"/>
-          <w:b/>
-          <w:kern w:val="0"/>
-          <w:szCs w:val="22"/>
-          <w:lang w:val="es-CO"/>
-        </w:rPr>
-        <w:t>N</w:t>
-      </w:r>
-      <w:r>
-        <w:rPr>
-          <w:rFonts w:ascii="Times New Roman" w:eastAsia="Times New Roman" w:hAnsi="Times New Roman" w:cs="Times New Roman"/>
-          <w:b/>
-          <w:kern w:val="0"/>
-          <w:szCs w:val="22"/>
-          <w:lang w:val="es-CO"/>
-        </w:rPr>
-        <w:t xml:space="preserve">ext </w:t>
+        <w:t xml:space="preserve">De la Rectoría surge Innovación, una iniciativa que busca implementar formas de aprendizaje </w:t>
       </w:r>
       <w:proofErr w:type="spellStart"/>
       <w:r>
         <w:rPr>
           <w:rFonts w:ascii="Times New Roman" w:eastAsia="Times New Roman" w:hAnsi="Times New Roman" w:cs="Times New Roman"/>
-          <w:b/>
-          <w:kern w:val="0"/>
-          <w:szCs w:val="22"/>
-          <w:lang w:val="es-CO"/>
-        </w:rPr>
-        <w:t>L</w:t>
-      </w:r>
-      <w:r>
-        <w:rPr>
-          <w:rFonts w:ascii="Times New Roman" w:eastAsia="Times New Roman" w:hAnsi="Times New Roman" w:cs="Times New Roman"/>
-          <w:b/>
-          <w:kern w:val="0"/>
-          <w:szCs w:val="22"/>
-          <w:lang w:val="es-CO"/>
-        </w:rPr>
-        <w:t>evel</w:t>
+          <w:kern w:val="0"/>
+          <w:szCs w:val="22"/>
+          <w:lang w:val="es-CO"/>
+        </w:rPr>
+        <w:t>neurodiversas</w:t>
       </w:r>
       <w:proofErr w:type="spellEnd"/>
       <w:r>
@@ -5435,25 +5439,7 @@
           <w:szCs w:val="22"/>
           <w:lang w:val="es-CO"/>
         </w:rPr>
-        <w:t xml:space="preserve"> surge de está subárea específicamente en "</w:t>
-      </w:r>
-      <w:r>
-        <w:rPr>
-          <w:rFonts w:ascii="Times New Roman" w:eastAsia="Times New Roman" w:hAnsi="Times New Roman" w:cs="Times New Roman"/>
-          <w:kern w:val="0"/>
-          <w:szCs w:val="22"/>
-          <w:lang w:val="es-CO"/>
-        </w:rPr>
-        <w:t>neuro diversos</w:t>
-      </w:r>
-      <w:r>
-        <w:rPr>
-          <w:rFonts w:ascii="Times New Roman" w:eastAsia="Times New Roman" w:hAnsi="Times New Roman" w:cs="Times New Roman"/>
-          <w:kern w:val="0"/>
-          <w:szCs w:val="22"/>
-          <w:lang w:val="es-CO"/>
-        </w:rPr>
-        <w:t xml:space="preserve">" donde se sugiere un método llamado </w:t>
+        <w:t xml:space="preserve"> y metodologías como el </w:t>
       </w:r>
       <w:proofErr w:type="spellStart"/>
       <w:r>
@@ -5486,15 +5472,6 @@
         <w:t>learning</w:t>
       </w:r>
       <w:proofErr w:type="spellEnd"/>
-      <w:r>
-        <w:rPr>
-          <w:rFonts w:ascii="Times New Roman" w:eastAsia="Times New Roman" w:hAnsi="Times New Roman" w:cs="Times New Roman"/>
-          <w:kern w:val="0"/>
-          <w:szCs w:val="22"/>
-          <w:lang w:val="es-CO"/>
-        </w:rPr>
-        <w:t>.</w:t>
-      </w:r>
     </w:p>
     <w:p>
       <w:pPr>
@@ -5514,28 +5491,17 @@
           <w:szCs w:val="22"/>
           <w:lang w:val="es-CO"/>
         </w:rPr>
-        <w:t>Actualmente el</w:t>
-      </w:r>
-      <w:r>
-        <w:rPr>
-          <w:rFonts w:ascii="Times New Roman" w:eastAsia="Times New Roman" w:hAnsi="Times New Roman" w:cs="Times New Roman"/>
-          <w:b/>
-          <w:kern w:val="0"/>
-          <w:szCs w:val="22"/>
-          <w:lang w:val="es-CO"/>
-        </w:rPr>
-        <w:t xml:space="preserve"> Next </w:t>
+        <w:t xml:space="preserve">A partir de esta propuesta nace </w:t>
       </w:r>
       <w:proofErr w:type="spellStart"/>
       <w:r>
         <w:rPr>
           <w:rFonts w:ascii="Times New Roman" w:eastAsia="Times New Roman" w:hAnsi="Times New Roman" w:cs="Times New Roman"/>
-          <w:b/>
-          <w:kern w:val="0"/>
-          <w:szCs w:val="22"/>
-          <w:lang w:val="es-CO"/>
-        </w:rPr>
-        <w:t>Level</w:t>
+          <w:kern w:val="0"/>
+          <w:szCs w:val="22"/>
+          <w:lang w:val="es-CO"/>
+        </w:rPr>
+        <w:t>NextLevel</w:t>
       </w:r>
       <w:proofErr w:type="spellEnd"/>
       <w:r>
@@ -5545,557 +5511,7 @@
           <w:szCs w:val="22"/>
           <w:lang w:val="es-CO"/>
         </w:rPr>
-        <w:t xml:space="preserve"> </w:t>
-      </w:r>
-      <w:r>
-        <w:rPr>
-          <w:rFonts w:ascii="Times New Roman" w:eastAsia="Times New Roman" w:hAnsi="Times New Roman" w:cs="Times New Roman"/>
-          <w:kern w:val="0"/>
-          <w:szCs w:val="22"/>
-          <w:lang w:val="es-CO"/>
-        </w:rPr>
-        <w:t xml:space="preserve">funciona con tecnologías como Google </w:t>
-      </w:r>
-      <w:proofErr w:type="spellStart"/>
-      <w:r>
-        <w:rPr>
-          <w:rFonts w:ascii="Times New Roman" w:eastAsia="Times New Roman" w:hAnsi="Times New Roman" w:cs="Times New Roman"/>
-          <w:kern w:val="0"/>
-          <w:szCs w:val="22"/>
-          <w:lang w:val="es-CO"/>
-        </w:rPr>
-        <w:t>forms</w:t>
-      </w:r>
-      <w:proofErr w:type="spellEnd"/>
-      <w:r>
-        <w:rPr>
-          <w:rFonts w:ascii="Times New Roman" w:eastAsia="Times New Roman" w:hAnsi="Times New Roman" w:cs="Times New Roman"/>
-          <w:kern w:val="0"/>
-          <w:szCs w:val="22"/>
-          <w:lang w:val="es-CO"/>
-        </w:rPr>
-        <w:t xml:space="preserve">, el </w:t>
-      </w:r>
-      <w:r>
-        <w:rPr>
-          <w:rFonts w:ascii="Times New Roman" w:eastAsia="Times New Roman" w:hAnsi="Times New Roman" w:cs="Times New Roman"/>
-          <w:kern w:val="0"/>
-          <w:szCs w:val="22"/>
-          <w:lang w:val="es-CO"/>
-        </w:rPr>
-        <w:t>cual</w:t>
-      </w:r>
-      <w:r>
-        <w:rPr>
-          <w:rFonts w:ascii="Times New Roman" w:eastAsia="Times New Roman" w:hAnsi="Times New Roman" w:cs="Times New Roman"/>
-          <w:kern w:val="0"/>
-          <w:szCs w:val="22"/>
-          <w:lang w:val="es-CO"/>
-        </w:rPr>
-        <w:t xml:space="preserve"> requiere de una actualización constante y careciendo de una plataforma establecida para la publicación de estos formularios. Por otro</w:t>
-      </w:r>
-      <w:r>
-        <w:rPr>
-          <w:rFonts w:ascii="Times New Roman" w:eastAsia="Times New Roman" w:hAnsi="Times New Roman" w:cs="Times New Roman"/>
-          <w:kern w:val="0"/>
-          <w:szCs w:val="22"/>
-          <w:lang w:val="es-CO"/>
-        </w:rPr>
-        <w:t xml:space="preserve"> </w:t>
-      </w:r>
-      <w:r>
-        <w:rPr>
-          <w:rFonts w:ascii="Times New Roman" w:eastAsia="Times New Roman" w:hAnsi="Times New Roman" w:cs="Times New Roman"/>
-          <w:kern w:val="0"/>
-          <w:szCs w:val="22"/>
-          <w:lang w:val="es-CO"/>
-        </w:rPr>
-        <w:t>lado,</w:t>
-      </w:r>
-      <w:r>
-        <w:rPr>
-          <w:rFonts w:ascii="Times New Roman" w:eastAsia="Times New Roman" w:hAnsi="Times New Roman" w:cs="Times New Roman"/>
-          <w:kern w:val="0"/>
-          <w:szCs w:val="22"/>
-          <w:lang w:val="es-CO"/>
-        </w:rPr>
-        <w:t xml:space="preserve"> al momento de administrar los turnos se hace uso de Excel dónde para poder actualizar los turnos establecidos hay que esperar que terminen.</w:t>
-      </w:r>
-    </w:p>
-    <w:p>
-      <w:pPr>
-        <w:pStyle w:val="Textbody"/>
-        <w:ind w:left="709"/>
-        <w:rPr>
-          <w:rFonts w:ascii="Times New Roman" w:eastAsia="Times New Roman" w:hAnsi="Times New Roman" w:cs="Times New Roman"/>
-          <w:kern w:val="0"/>
-          <w:szCs w:val="22"/>
-          <w:lang w:val="es-CO"/>
-        </w:rPr>
-      </w:pPr>
-      <w:r>
-        <w:rPr>
-          <w:rFonts w:ascii="Times New Roman" w:eastAsia="Times New Roman" w:hAnsi="Times New Roman" w:cs="Times New Roman"/>
-          <w:kern w:val="0"/>
-          <w:szCs w:val="22"/>
-          <w:lang w:val="es-CO"/>
-        </w:rPr>
-        <w:t xml:space="preserve">En el presente </w:t>
-      </w:r>
-      <w:r>
-        <w:rPr>
-          <w:rFonts w:ascii="Times New Roman" w:eastAsia="Times New Roman" w:hAnsi="Times New Roman" w:cs="Times New Roman"/>
-          <w:b/>
-          <w:kern w:val="0"/>
-          <w:szCs w:val="22"/>
-          <w:lang w:val="es-CO"/>
-        </w:rPr>
-        <w:t xml:space="preserve">Next </w:t>
-      </w:r>
-      <w:proofErr w:type="spellStart"/>
-      <w:r>
-        <w:rPr>
-          <w:rFonts w:ascii="Times New Roman" w:eastAsia="Times New Roman" w:hAnsi="Times New Roman" w:cs="Times New Roman"/>
-          <w:b/>
-          <w:kern w:val="0"/>
-          <w:szCs w:val="22"/>
-          <w:lang w:val="es-CO"/>
-        </w:rPr>
-        <w:t>Level</w:t>
-      </w:r>
-      <w:proofErr w:type="spellEnd"/>
-      <w:r>
-        <w:rPr>
-          <w:rFonts w:ascii="Times New Roman" w:eastAsia="Times New Roman" w:hAnsi="Times New Roman" w:cs="Times New Roman"/>
-          <w:kern w:val="0"/>
-          <w:szCs w:val="22"/>
-          <w:lang w:val="es-CO"/>
-        </w:rPr>
-        <w:t xml:space="preserve"> no cuenta con ninguna tecnología que recomiende juegos y/o fomente la competitividad de los estudiantes, algo que sería vital para una organización como</w:t>
-      </w:r>
-      <w:r>
-        <w:rPr>
-          <w:rFonts w:ascii="Times New Roman" w:eastAsia="Times New Roman" w:hAnsi="Times New Roman" w:cs="Times New Roman"/>
-          <w:b/>
-          <w:kern w:val="0"/>
-          <w:szCs w:val="22"/>
-          <w:lang w:val="es-CO"/>
-        </w:rPr>
-        <w:t xml:space="preserve"> </w:t>
-      </w:r>
-      <w:r>
-        <w:rPr>
-          <w:rFonts w:ascii="Times New Roman" w:eastAsia="Times New Roman" w:hAnsi="Times New Roman" w:cs="Times New Roman"/>
-          <w:b/>
-          <w:kern w:val="0"/>
-          <w:szCs w:val="22"/>
-          <w:lang w:val="es-CO"/>
-        </w:rPr>
-        <w:t xml:space="preserve">Next </w:t>
-      </w:r>
-      <w:proofErr w:type="spellStart"/>
-      <w:r>
-        <w:rPr>
-          <w:rFonts w:ascii="Times New Roman" w:eastAsia="Times New Roman" w:hAnsi="Times New Roman" w:cs="Times New Roman"/>
-          <w:b/>
-          <w:kern w:val="0"/>
-          <w:szCs w:val="22"/>
-          <w:lang w:val="es-CO"/>
-        </w:rPr>
-        <w:t>Level</w:t>
-      </w:r>
-      <w:proofErr w:type="spellEnd"/>
-      <w:r>
-        <w:rPr>
-          <w:rFonts w:ascii="Times New Roman" w:eastAsia="Times New Roman" w:hAnsi="Times New Roman" w:cs="Times New Roman"/>
-          <w:kern w:val="0"/>
-          <w:szCs w:val="22"/>
-          <w:lang w:val="es-CO"/>
-        </w:rPr>
-        <w:t>.</w:t>
-      </w:r>
-    </w:p>
-    <w:p>
-      <w:pPr>
-        <w:pStyle w:val="Textbody"/>
-        <w:rPr>
-          <w:rFonts w:ascii="Times New Roman" w:eastAsia="Times New Roman" w:hAnsi="Times New Roman" w:cs="Times New Roman"/>
-          <w:kern w:val="0"/>
-          <w:szCs w:val="22"/>
-          <w:lang w:val="es-CO"/>
-        </w:rPr>
-      </w:pPr>
-      <w:r>
-        <w:rPr>
-          <w:rFonts w:ascii="Times New Roman" w:eastAsia="Times New Roman" w:hAnsi="Times New Roman" w:cs="Times New Roman"/>
-          <w:b/>
-          <w:bCs/>
-          <w:kern w:val="0"/>
-          <w:szCs w:val="22"/>
-          <w:lang w:val="es-CO"/>
-        </w:rPr>
-        <w:t>Secretaría General:</w:t>
-      </w:r>
-      <w:r>
-        <w:rPr>
-          <w:rFonts w:ascii="Times New Roman" w:eastAsia="Times New Roman" w:hAnsi="Times New Roman" w:cs="Times New Roman"/>
-          <w:kern w:val="0"/>
-          <w:szCs w:val="22"/>
-          <w:lang w:val="es-CO"/>
-        </w:rPr>
-        <w:t xml:space="preserve"> Gestiona asuntos legales y administrativos, destacando recientemente por liderar el Plan Estratégico de Bienestar Laboral.</w:t>
-      </w:r>
-    </w:p>
-    <w:p>
-      <w:pPr>
-        <w:pStyle w:val="Textbody"/>
-        <w:rPr>
-          <w:rFonts w:ascii="Times New Roman" w:eastAsia="Times New Roman" w:hAnsi="Times New Roman" w:cs="Times New Roman"/>
-          <w:b/>
-          <w:bCs/>
-          <w:kern w:val="0"/>
-          <w:szCs w:val="22"/>
-          <w:lang w:val="es-CO"/>
-        </w:rPr>
-      </w:pPr>
-      <w:r>
-        <w:rPr>
-          <w:rFonts w:ascii="Times New Roman" w:eastAsia="Times New Roman" w:hAnsi="Times New Roman" w:cs="Times New Roman"/>
-          <w:b/>
-          <w:bCs/>
-          <w:kern w:val="0"/>
-          <w:szCs w:val="22"/>
-          <w:lang w:val="es-CO"/>
-        </w:rPr>
-        <w:t>Dirección Administrativa y Financiera:</w:t>
-      </w:r>
-    </w:p>
-    <w:p>
-      <w:pPr>
-        <w:pStyle w:val="Textbody"/>
-        <w:rPr>
-          <w:rFonts w:ascii="Times New Roman" w:eastAsia="Times New Roman" w:hAnsi="Times New Roman" w:cs="Times New Roman"/>
-          <w:kern w:val="0"/>
-          <w:szCs w:val="22"/>
-          <w:lang w:val="es-CO"/>
-        </w:rPr>
-      </w:pPr>
-      <w:r>
-        <w:rPr>
-          <w:rFonts w:ascii="Times New Roman" w:eastAsia="Times New Roman" w:hAnsi="Times New Roman" w:cs="Times New Roman"/>
-          <w:kern w:val="0"/>
-          <w:szCs w:val="22"/>
-          <w:lang w:val="es-CO"/>
-        </w:rPr>
-        <w:t>Administra los recursos económicos de la institución y brinda orientación sobre la Política de Gratuidad (Matrícula Cero).</w:t>
-      </w:r>
-    </w:p>
-    <w:p>
-      <w:pPr>
-        <w:pStyle w:val="Textbody"/>
-        <w:rPr>
-          <w:rFonts w:ascii="Times New Roman" w:eastAsia="Times New Roman" w:hAnsi="Times New Roman" w:cs="Times New Roman"/>
-          <w:kern w:val="0"/>
-          <w:szCs w:val="22"/>
-          <w:lang w:val="es-CO"/>
-        </w:rPr>
-      </w:pPr>
-      <w:r>
-        <w:rPr>
-          <w:rFonts w:ascii="Times New Roman" w:eastAsia="Times New Roman" w:hAnsi="Times New Roman" w:cs="Times New Roman"/>
-          <w:b/>
-          <w:bCs/>
-          <w:kern w:val="0"/>
-          <w:szCs w:val="22"/>
-          <w:lang w:val="es-CO"/>
-        </w:rPr>
-        <w:t>Dirección de Planeación:</w:t>
-      </w:r>
-      <w:r>
-        <w:rPr>
-          <w:rFonts w:ascii="Times New Roman" w:eastAsia="Times New Roman" w:hAnsi="Times New Roman" w:cs="Times New Roman"/>
-          <w:kern w:val="0"/>
-          <w:szCs w:val="22"/>
-          <w:lang w:val="es-CO"/>
-        </w:rPr>
-        <w:t xml:space="preserve"> Coordina la Planeación Institucional y el Sistema Integrado de Gestión (SIG) para el cumplimiento de metas estratégicas.</w:t>
-      </w:r>
-    </w:p>
-    <w:p>
-      <w:pPr>
-        <w:pStyle w:val="Textbody"/>
-        <w:rPr>
-          <w:rFonts w:ascii="Times New Roman" w:eastAsia="Times New Roman" w:hAnsi="Times New Roman" w:cs="Times New Roman"/>
-          <w:b/>
-          <w:bCs/>
-          <w:kern w:val="0"/>
-          <w:szCs w:val="22"/>
-          <w:lang w:val="es-CO"/>
-        </w:rPr>
-      </w:pPr>
-      <w:r>
-        <w:rPr>
-          <w:rFonts w:ascii="Times New Roman" w:eastAsia="Times New Roman" w:hAnsi="Times New Roman" w:cs="Times New Roman"/>
-          <w:b/>
-          <w:bCs/>
-          <w:kern w:val="0"/>
-          <w:szCs w:val="22"/>
-          <w:lang w:val="es-CO"/>
-        </w:rPr>
-        <w:t>Dirección de Bienestar Institucional:</w:t>
-      </w:r>
-    </w:p>
-    <w:p>
-      <w:pPr>
-        <w:pStyle w:val="Textbody"/>
-        <w:rPr>
-          <w:rFonts w:ascii="Times New Roman" w:eastAsia="Times New Roman" w:hAnsi="Times New Roman" w:cs="Times New Roman"/>
-          <w:kern w:val="0"/>
-          <w:szCs w:val="22"/>
-          <w:lang w:val="es-CO"/>
-        </w:rPr>
-      </w:pPr>
-      <w:r>
-        <w:rPr>
-          <w:rFonts w:ascii="Times New Roman" w:eastAsia="Times New Roman" w:hAnsi="Times New Roman" w:cs="Times New Roman"/>
-          <w:kern w:val="0"/>
-          <w:szCs w:val="22"/>
-          <w:lang w:val="es-CO"/>
-        </w:rPr>
-        <w:t>Promueve el desarrollo integral (salud, deporte, cultura) y gestiona apoyos como el Fondo Alimentario y Renta Joven.</w:t>
-      </w:r>
-    </w:p>
-    <w:p>
-      <w:pPr>
-        <w:pStyle w:val="Textbody"/>
-        <w:rPr>
-          <w:rFonts w:ascii="Times New Roman" w:eastAsia="Times New Roman" w:hAnsi="Times New Roman" w:cs="Times New Roman"/>
-          <w:kern w:val="0"/>
-          <w:szCs w:val="22"/>
-          <w:lang w:val="es-CO"/>
-        </w:rPr>
-      </w:pPr>
-      <w:r>
-        <w:rPr>
-          <w:rFonts w:ascii="Times New Roman" w:eastAsia="Times New Roman" w:hAnsi="Times New Roman" w:cs="Times New Roman"/>
-          <w:b/>
-          <w:bCs/>
-          <w:kern w:val="0"/>
-          <w:szCs w:val="22"/>
-          <w:lang w:val="es-CO"/>
-        </w:rPr>
-        <w:t>Dirección de Extensión Académica y Regionalización:</w:t>
-      </w:r>
-    </w:p>
-    <w:p>
-      <w:pPr>
-        <w:pStyle w:val="Textbody"/>
-        <w:rPr>
-          <w:rFonts w:ascii="Times New Roman" w:eastAsia="Times New Roman" w:hAnsi="Times New Roman" w:cs="Times New Roman"/>
-          <w:kern w:val="0"/>
-          <w:szCs w:val="22"/>
-          <w:lang w:val="es-CO"/>
-        </w:rPr>
-      </w:pPr>
-      <w:r>
-        <w:rPr>
-          <w:rFonts w:ascii="Times New Roman" w:eastAsia="Times New Roman" w:hAnsi="Times New Roman" w:cs="Times New Roman"/>
-          <w:kern w:val="0"/>
-          <w:szCs w:val="22"/>
-          <w:lang w:val="es-CO"/>
-        </w:rPr>
-        <w:t xml:space="preserve"> Coordina la educación continua y expande la oferta académica a zonas vulnerables mediante la estrategia "Territorio </w:t>
-      </w:r>
-      <w:proofErr w:type="spellStart"/>
-      <w:r>
-        <w:rPr>
-          <w:rFonts w:ascii="Times New Roman" w:eastAsia="Times New Roman" w:hAnsi="Times New Roman" w:cs="Times New Roman"/>
-          <w:kern w:val="0"/>
-          <w:szCs w:val="22"/>
-          <w:lang w:val="es-CO"/>
-        </w:rPr>
-        <w:t>TdeA</w:t>
-      </w:r>
-      <w:proofErr w:type="spellEnd"/>
-      <w:r>
-        <w:rPr>
-          <w:rFonts w:ascii="Times New Roman" w:eastAsia="Times New Roman" w:hAnsi="Times New Roman" w:cs="Times New Roman"/>
-          <w:kern w:val="0"/>
-          <w:szCs w:val="22"/>
-          <w:lang w:val="es-CO"/>
-        </w:rPr>
-        <w:t>".</w:t>
-      </w:r>
-    </w:p>
-    <w:p>
-      <w:pPr>
-        <w:pStyle w:val="Textbody"/>
-        <w:rPr>
-          <w:rFonts w:ascii="Times New Roman" w:eastAsia="Times New Roman" w:hAnsi="Times New Roman" w:cs="Times New Roman"/>
-          <w:kern w:val="0"/>
-          <w:szCs w:val="22"/>
-          <w:lang w:val="es-CO"/>
-        </w:rPr>
-      </w:pPr>
-      <w:r>
-        <w:rPr>
-          <w:rFonts w:ascii="Times New Roman" w:eastAsia="Times New Roman" w:hAnsi="Times New Roman" w:cs="Times New Roman"/>
-          <w:b/>
-          <w:bCs/>
-          <w:kern w:val="0"/>
-          <w:szCs w:val="22"/>
-          <w:lang w:val="es-CO"/>
-        </w:rPr>
-        <w:t>Control Interno:</w:t>
-      </w:r>
-      <w:r>
-        <w:rPr>
-          <w:rFonts w:ascii="Times New Roman" w:eastAsia="Times New Roman" w:hAnsi="Times New Roman" w:cs="Times New Roman"/>
-          <w:kern w:val="0"/>
-          <w:szCs w:val="22"/>
-          <w:lang w:val="es-CO"/>
-        </w:rPr>
-        <w:t xml:space="preserve"> Funciona como una unidad estratégica para garantizar el seguimiento normativo y la transparencia en los procesos de la organización.</w:t>
-      </w:r>
-    </w:p>
-    <w:p>
-      <w:pPr>
-        <w:pStyle w:val="Textbody"/>
-        <w:rPr>
-          <w:rFonts w:ascii="Times New Roman" w:eastAsia="Times New Roman" w:hAnsi="Times New Roman" w:cs="Times New Roman"/>
-          <w:kern w:val="0"/>
-          <w:szCs w:val="22"/>
-          <w:lang w:val="es-CO"/>
-        </w:rPr>
-      </w:pPr>
-      <w:r>
-        <w:rPr>
-          <w:rFonts w:ascii="Times New Roman" w:eastAsia="Times New Roman" w:hAnsi="Times New Roman" w:cs="Times New Roman"/>
-          <w:kern w:val="0"/>
-          <w:szCs w:val="22"/>
-          <w:lang w:val="es-CO"/>
-        </w:rPr>
-        <w:t xml:space="preserve">Se tomará mayor énfasis en el área de Rectoría, ya que de allí se desprende la iniciativa que se acogerá como proyecto, relacionada con propuestas de innovación educativa que buscan métodos de estudio </w:t>
-      </w:r>
-      <w:proofErr w:type="spellStart"/>
-      <w:r>
-        <w:rPr>
-          <w:rFonts w:ascii="Times New Roman" w:eastAsia="Times New Roman" w:hAnsi="Times New Roman" w:cs="Times New Roman"/>
-          <w:kern w:val="0"/>
-          <w:szCs w:val="22"/>
-          <w:lang w:val="es-CO"/>
-        </w:rPr>
-        <w:t>neurodiversos</w:t>
-      </w:r>
-      <w:proofErr w:type="spellEnd"/>
-      <w:r>
-        <w:rPr>
-          <w:rFonts w:ascii="Times New Roman" w:eastAsia="Times New Roman" w:hAnsi="Times New Roman" w:cs="Times New Roman"/>
-          <w:kern w:val="0"/>
-          <w:szCs w:val="22"/>
-          <w:lang w:val="es-CO"/>
-        </w:rPr>
-        <w:t xml:space="preserve"> como el </w:t>
-      </w:r>
-      <w:proofErr w:type="spellStart"/>
-      <w:r>
-        <w:rPr>
-          <w:rFonts w:ascii="Times New Roman" w:eastAsia="Times New Roman" w:hAnsi="Times New Roman" w:cs="Times New Roman"/>
-          <w:kern w:val="0"/>
-          <w:szCs w:val="22"/>
-          <w:lang w:val="es-CO"/>
-        </w:rPr>
-        <w:t>game-based</w:t>
-      </w:r>
-      <w:proofErr w:type="spellEnd"/>
-      <w:r>
-        <w:rPr>
-          <w:rFonts w:ascii="Times New Roman" w:eastAsia="Times New Roman" w:hAnsi="Times New Roman" w:cs="Times New Roman"/>
-          <w:kern w:val="0"/>
-          <w:szCs w:val="22"/>
-          <w:lang w:val="es-CO"/>
-        </w:rPr>
-        <w:t xml:space="preserve"> </w:t>
-      </w:r>
-      <w:proofErr w:type="spellStart"/>
-      <w:r>
-        <w:rPr>
-          <w:rFonts w:ascii="Times New Roman" w:eastAsia="Times New Roman" w:hAnsi="Times New Roman" w:cs="Times New Roman"/>
-          <w:kern w:val="0"/>
-          <w:szCs w:val="22"/>
-          <w:lang w:val="es-CO"/>
-        </w:rPr>
-        <w:t>learning</w:t>
-      </w:r>
-      <w:proofErr w:type="spellEnd"/>
-      <w:r>
-        <w:rPr>
-          <w:rFonts w:ascii="Times New Roman" w:eastAsia="Times New Roman" w:hAnsi="Times New Roman" w:cs="Times New Roman"/>
-          <w:kern w:val="0"/>
-          <w:szCs w:val="22"/>
-          <w:lang w:val="es-CO"/>
-        </w:rPr>
-        <w:t xml:space="preserve">, de donde surge la idea de Next </w:t>
-      </w:r>
-      <w:proofErr w:type="spellStart"/>
-      <w:r>
-        <w:rPr>
-          <w:rFonts w:ascii="Times New Roman" w:eastAsia="Times New Roman" w:hAnsi="Times New Roman" w:cs="Times New Roman"/>
-          <w:kern w:val="0"/>
-          <w:szCs w:val="22"/>
-          <w:lang w:val="es-CO"/>
-        </w:rPr>
-        <w:t>Level</w:t>
-      </w:r>
-      <w:proofErr w:type="spellEnd"/>
-      <w:r>
-        <w:rPr>
-          <w:rFonts w:ascii="Times New Roman" w:eastAsia="Times New Roman" w:hAnsi="Times New Roman" w:cs="Times New Roman"/>
-          <w:kern w:val="0"/>
-          <w:szCs w:val="22"/>
-          <w:lang w:val="es-CO"/>
-        </w:rPr>
-        <w:t xml:space="preserve"> como un “Laboratorio de Videojuegos”.</w:t>
-      </w:r>
-    </w:p>
-    <w:p>
-      <w:pPr>
-        <w:pStyle w:val="Textbody"/>
-        <w:rPr>
-          <w:rFonts w:ascii="Times New Roman" w:eastAsia="Times New Roman" w:hAnsi="Times New Roman" w:cs="Times New Roman"/>
-          <w:kern w:val="0"/>
-          <w:szCs w:val="22"/>
-          <w:lang w:val="es-CO"/>
-        </w:rPr>
-      </w:pPr>
-      <w:r>
-        <w:rPr>
-          <w:rFonts w:ascii="Times New Roman" w:eastAsia="Times New Roman" w:hAnsi="Times New Roman" w:cs="Times New Roman"/>
-          <w:kern w:val="0"/>
-          <w:szCs w:val="22"/>
-          <w:lang w:val="es-CO"/>
-        </w:rPr>
-        <w:t xml:space="preserve">El </w:t>
-      </w:r>
-      <w:proofErr w:type="spellStart"/>
-      <w:r>
-        <w:rPr>
-          <w:rFonts w:ascii="Times New Roman" w:eastAsia="Times New Roman" w:hAnsi="Times New Roman" w:cs="Times New Roman"/>
-          <w:kern w:val="0"/>
-          <w:szCs w:val="22"/>
-          <w:lang w:val="es-CO"/>
-        </w:rPr>
-        <w:t>Tdea</w:t>
-      </w:r>
-      <w:proofErr w:type="spellEnd"/>
-      <w:r>
-        <w:rPr>
-          <w:rFonts w:ascii="Times New Roman" w:eastAsia="Times New Roman" w:hAnsi="Times New Roman" w:cs="Times New Roman"/>
-          <w:kern w:val="0"/>
-          <w:szCs w:val="22"/>
-          <w:lang w:val="es-CO"/>
-        </w:rPr>
-        <w:t xml:space="preserve"> también cuenta con una variedad de facultades las cuales son consideradas el eje estructural y el "corazón académico" que impulsa la formación integral, la innovación y el compromiso social. La institución cuenta con las siguientes facultades:</w:t>
+        <w:t>, el cual fue acogido e integrado por la Facultad de Educación, impulsora de la formación integral y el compromiso social.</w:t>
       </w:r>
     </w:p>
     <w:p>
@@ -6121,16 +5537,441 @@
           <w:szCs w:val="22"/>
           <w:lang w:val="es-CO"/>
         </w:rPr>
-        <w:t>Facultad de Ciencias Administrativas y Económicas:</w:t>
-      </w:r>
-      <w:r>
-        <w:rPr>
-          <w:rFonts w:ascii="Times New Roman" w:eastAsia="Times New Roman" w:hAnsi="Times New Roman" w:cs="Times New Roman"/>
-          <w:kern w:val="0"/>
-          <w:szCs w:val="22"/>
-          <w:lang w:val="es-CO"/>
-        </w:rPr>
-        <w:t xml:space="preserve"> Se centra en formar profesionales con una "visión estratégica y gerencial"  para la gestión eficiente de organizaciones y cadenas de suministro.</w:t>
+        <w:t>Facultad de Educación y Ciencias Sociales:</w:t>
+      </w:r>
+      <w:r>
+        <w:rPr>
+          <w:rFonts w:ascii="Times New Roman" w:eastAsia="Times New Roman" w:hAnsi="Times New Roman" w:cs="Times New Roman"/>
+          <w:kern w:val="0"/>
+          <w:szCs w:val="22"/>
+          <w:lang w:val="es-CO"/>
+        </w:rPr>
+        <w:t xml:space="preserve"> Enfocada en la formación humana y el desarrollo social, ofrece programas de alto nivel como el "Doctorado en Educación y Estudios Sociales" y maestrías en pedagogía digital.</w:t>
+      </w:r>
+      <w:r>
+        <w:rPr>
+          <w:rFonts w:ascii="Times New Roman" w:eastAsia="Times New Roman" w:hAnsi="Times New Roman" w:cs="Times New Roman"/>
+          <w:kern w:val="0"/>
+          <w:szCs w:val="22"/>
+          <w:lang w:val="es-CO"/>
+        </w:rPr>
+        <w:t xml:space="preserve"> (Actualmente encargada de la iniciativa </w:t>
+      </w:r>
+      <w:r>
+        <w:rPr>
+          <w:rFonts w:ascii="Times New Roman" w:eastAsia="Times New Roman" w:hAnsi="Times New Roman" w:cs="Times New Roman"/>
+          <w:b/>
+          <w:bCs/>
+          <w:kern w:val="0"/>
+          <w:szCs w:val="22"/>
+          <w:lang w:val="es-CO"/>
+        </w:rPr>
+        <w:t xml:space="preserve">Next </w:t>
+      </w:r>
+      <w:proofErr w:type="spellStart"/>
+      <w:r>
+        <w:rPr>
+          <w:rFonts w:ascii="Times New Roman" w:eastAsia="Times New Roman" w:hAnsi="Times New Roman" w:cs="Times New Roman"/>
+          <w:b/>
+          <w:bCs/>
+          <w:kern w:val="0"/>
+          <w:szCs w:val="22"/>
+          <w:lang w:val="es-CO"/>
+        </w:rPr>
+        <w:t>Level</w:t>
+      </w:r>
+      <w:proofErr w:type="spellEnd"/>
+      <w:r>
+        <w:rPr>
+          <w:rFonts w:ascii="Times New Roman" w:eastAsia="Times New Roman" w:hAnsi="Times New Roman" w:cs="Times New Roman"/>
+          <w:kern w:val="0"/>
+          <w:szCs w:val="22"/>
+          <w:lang w:val="es-CO"/>
+        </w:rPr>
+        <w:t>)</w:t>
+      </w:r>
+    </w:p>
+    <w:p>
+      <w:pPr>
+        <w:pStyle w:val="Textbody"/>
+        <w:rPr>
+          <w:rFonts w:ascii="Times New Roman" w:eastAsia="Times New Roman" w:hAnsi="Times New Roman" w:cs="Times New Roman"/>
+          <w:kern w:val="0"/>
+          <w:szCs w:val="22"/>
+          <w:lang w:val="es-CO"/>
+        </w:rPr>
+      </w:pPr>
+      <w:r>
+        <w:rPr>
+          <w:rFonts w:ascii="Times New Roman" w:eastAsia="Times New Roman" w:hAnsi="Times New Roman" w:cs="Times New Roman"/>
+          <w:b/>
+          <w:bCs/>
+          <w:kern w:val="0"/>
+          <w:szCs w:val="22"/>
+          <w:lang w:val="es-CO"/>
+        </w:rPr>
+        <w:t>Secretaría General:</w:t>
+      </w:r>
+      <w:r>
+        <w:rPr>
+          <w:rFonts w:ascii="Times New Roman" w:eastAsia="Times New Roman" w:hAnsi="Times New Roman" w:cs="Times New Roman"/>
+          <w:kern w:val="0"/>
+          <w:szCs w:val="22"/>
+          <w:lang w:val="es-CO"/>
+        </w:rPr>
+        <w:t xml:space="preserve"> Gestiona asuntos legales y administrativos, destacando recientemente por liderar el Plan Estratégico de Bienestar Laboral.</w:t>
+      </w:r>
+    </w:p>
+    <w:p>
+      <w:pPr>
+        <w:pStyle w:val="Textbody"/>
+        <w:rPr>
+          <w:rFonts w:ascii="Times New Roman" w:eastAsia="Times New Roman" w:hAnsi="Times New Roman" w:cs="Times New Roman"/>
+          <w:b/>
+          <w:bCs/>
+          <w:kern w:val="0"/>
+          <w:szCs w:val="22"/>
+          <w:lang w:val="es-CO"/>
+        </w:rPr>
+      </w:pPr>
+      <w:r>
+        <w:rPr>
+          <w:rFonts w:ascii="Times New Roman" w:eastAsia="Times New Roman" w:hAnsi="Times New Roman" w:cs="Times New Roman"/>
+          <w:b/>
+          <w:bCs/>
+          <w:kern w:val="0"/>
+          <w:szCs w:val="22"/>
+          <w:lang w:val="es-CO"/>
+        </w:rPr>
+        <w:t>Dirección Administrativa y Financiera:</w:t>
+      </w:r>
+    </w:p>
+    <w:p>
+      <w:pPr>
+        <w:pStyle w:val="Textbody"/>
+        <w:rPr>
+          <w:rFonts w:ascii="Times New Roman" w:eastAsia="Times New Roman" w:hAnsi="Times New Roman" w:cs="Times New Roman"/>
+          <w:kern w:val="0"/>
+          <w:szCs w:val="22"/>
+          <w:lang w:val="es-CO"/>
+        </w:rPr>
+      </w:pPr>
+      <w:r>
+        <w:rPr>
+          <w:rFonts w:ascii="Times New Roman" w:eastAsia="Times New Roman" w:hAnsi="Times New Roman" w:cs="Times New Roman"/>
+          <w:kern w:val="0"/>
+          <w:szCs w:val="22"/>
+          <w:lang w:val="es-CO"/>
+        </w:rPr>
+        <w:t>Administra los recursos económicos de la institución y brinda orientación sobre la Política de Gratuidad (Matrícula Cero).</w:t>
+      </w:r>
+    </w:p>
+    <w:p>
+      <w:pPr>
+        <w:pStyle w:val="Textbody"/>
+        <w:rPr>
+          <w:rFonts w:ascii="Times New Roman" w:eastAsia="Times New Roman" w:hAnsi="Times New Roman" w:cs="Times New Roman"/>
+          <w:kern w:val="0"/>
+          <w:szCs w:val="22"/>
+          <w:lang w:val="es-CO"/>
+        </w:rPr>
+      </w:pPr>
+      <w:r>
+        <w:rPr>
+          <w:rFonts w:ascii="Times New Roman" w:eastAsia="Times New Roman" w:hAnsi="Times New Roman" w:cs="Times New Roman"/>
+          <w:b/>
+          <w:bCs/>
+          <w:kern w:val="0"/>
+          <w:szCs w:val="22"/>
+          <w:lang w:val="es-CO"/>
+        </w:rPr>
+        <w:t>Dirección de Planeación:</w:t>
+      </w:r>
+      <w:r>
+        <w:rPr>
+          <w:rFonts w:ascii="Times New Roman" w:eastAsia="Times New Roman" w:hAnsi="Times New Roman" w:cs="Times New Roman"/>
+          <w:kern w:val="0"/>
+          <w:szCs w:val="22"/>
+          <w:lang w:val="es-CO"/>
+        </w:rPr>
+        <w:t xml:space="preserve"> Coordina la Planeación Institucional y el Sistema Integrado de Gestión (SIG) para el cumplimiento de metas estratégicas.</w:t>
+      </w:r>
+    </w:p>
+    <w:p>
+      <w:pPr>
+        <w:pStyle w:val="Textbody"/>
+        <w:rPr>
+          <w:rFonts w:ascii="Times New Roman" w:eastAsia="Times New Roman" w:hAnsi="Times New Roman" w:cs="Times New Roman"/>
+          <w:b/>
+          <w:bCs/>
+          <w:kern w:val="0"/>
+          <w:szCs w:val="22"/>
+          <w:lang w:val="es-CO"/>
+        </w:rPr>
+      </w:pPr>
+      <w:r>
+        <w:rPr>
+          <w:rFonts w:ascii="Times New Roman" w:eastAsia="Times New Roman" w:hAnsi="Times New Roman" w:cs="Times New Roman"/>
+          <w:b/>
+          <w:bCs/>
+          <w:kern w:val="0"/>
+          <w:szCs w:val="22"/>
+          <w:lang w:val="es-CO"/>
+        </w:rPr>
+        <w:t>Dirección de Bienestar Institucional:</w:t>
+      </w:r>
+    </w:p>
+    <w:p>
+      <w:pPr>
+        <w:pStyle w:val="Textbody"/>
+        <w:rPr>
+          <w:rFonts w:ascii="Times New Roman" w:eastAsia="Times New Roman" w:hAnsi="Times New Roman" w:cs="Times New Roman"/>
+          <w:kern w:val="0"/>
+          <w:szCs w:val="22"/>
+          <w:lang w:val="es-CO"/>
+        </w:rPr>
+      </w:pPr>
+      <w:r>
+        <w:rPr>
+          <w:rFonts w:ascii="Times New Roman" w:eastAsia="Times New Roman" w:hAnsi="Times New Roman" w:cs="Times New Roman"/>
+          <w:kern w:val="0"/>
+          <w:szCs w:val="22"/>
+          <w:lang w:val="es-CO"/>
+        </w:rPr>
+        <w:t>Promueve el desarrollo integral (salud, deporte, cultura) y gestiona apoyos como el Fondo Alimentario y Renta Joven.</w:t>
+      </w:r>
+    </w:p>
+    <w:p>
+      <w:pPr>
+        <w:pStyle w:val="Textbody"/>
+        <w:rPr>
+          <w:rFonts w:ascii="Times New Roman" w:eastAsia="Times New Roman" w:hAnsi="Times New Roman" w:cs="Times New Roman"/>
+          <w:kern w:val="0"/>
+          <w:szCs w:val="22"/>
+          <w:lang w:val="es-CO"/>
+        </w:rPr>
+      </w:pPr>
+      <w:r>
+        <w:rPr>
+          <w:rFonts w:ascii="Times New Roman" w:eastAsia="Times New Roman" w:hAnsi="Times New Roman" w:cs="Times New Roman"/>
+          <w:b/>
+          <w:bCs/>
+          <w:kern w:val="0"/>
+          <w:szCs w:val="22"/>
+          <w:lang w:val="es-CO"/>
+        </w:rPr>
+        <w:t>Dirección de Extensión Académica y Regionalización:</w:t>
+      </w:r>
+    </w:p>
+    <w:p>
+      <w:pPr>
+        <w:pStyle w:val="Textbody"/>
+        <w:rPr>
+          <w:rFonts w:ascii="Times New Roman" w:eastAsia="Times New Roman" w:hAnsi="Times New Roman" w:cs="Times New Roman"/>
+          <w:kern w:val="0"/>
+          <w:szCs w:val="22"/>
+          <w:lang w:val="es-CO"/>
+        </w:rPr>
+      </w:pPr>
+      <w:r>
+        <w:rPr>
+          <w:rFonts w:ascii="Times New Roman" w:eastAsia="Times New Roman" w:hAnsi="Times New Roman" w:cs="Times New Roman"/>
+          <w:kern w:val="0"/>
+          <w:szCs w:val="22"/>
+          <w:lang w:val="es-CO"/>
+        </w:rPr>
+        <w:t xml:space="preserve"> Coordina la educación continua y expande la oferta académica a zonas vulnerables mediante la estrategia "Territorio </w:t>
+      </w:r>
+      <w:proofErr w:type="spellStart"/>
+      <w:r>
+        <w:rPr>
+          <w:rFonts w:ascii="Times New Roman" w:eastAsia="Times New Roman" w:hAnsi="Times New Roman" w:cs="Times New Roman"/>
+          <w:kern w:val="0"/>
+          <w:szCs w:val="22"/>
+          <w:lang w:val="es-CO"/>
+        </w:rPr>
+        <w:t>TdeA</w:t>
+      </w:r>
+      <w:proofErr w:type="spellEnd"/>
+      <w:r>
+        <w:rPr>
+          <w:rFonts w:ascii="Times New Roman" w:eastAsia="Times New Roman" w:hAnsi="Times New Roman" w:cs="Times New Roman"/>
+          <w:kern w:val="0"/>
+          <w:szCs w:val="22"/>
+          <w:lang w:val="es-CO"/>
+        </w:rPr>
+        <w:t>".</w:t>
+      </w:r>
+    </w:p>
+    <w:p>
+      <w:pPr>
+        <w:pStyle w:val="Textbody"/>
+        <w:rPr>
+          <w:rFonts w:ascii="Times New Roman" w:eastAsia="Times New Roman" w:hAnsi="Times New Roman" w:cs="Times New Roman"/>
+          <w:kern w:val="0"/>
+          <w:szCs w:val="22"/>
+          <w:lang w:val="es-CO"/>
+        </w:rPr>
+      </w:pPr>
+      <w:r>
+        <w:rPr>
+          <w:rFonts w:ascii="Times New Roman" w:eastAsia="Times New Roman" w:hAnsi="Times New Roman" w:cs="Times New Roman"/>
+          <w:b/>
+          <w:bCs/>
+          <w:kern w:val="0"/>
+          <w:szCs w:val="22"/>
+          <w:lang w:val="es-CO"/>
+        </w:rPr>
+        <w:t>Control Interno:</w:t>
+      </w:r>
+      <w:r>
+        <w:rPr>
+          <w:rFonts w:ascii="Times New Roman" w:eastAsia="Times New Roman" w:hAnsi="Times New Roman" w:cs="Times New Roman"/>
+          <w:kern w:val="0"/>
+          <w:szCs w:val="22"/>
+          <w:lang w:val="es-CO"/>
+        </w:rPr>
+        <w:t xml:space="preserve"> Funciona como una unidad estratégica para garantizar el seguimiento normativo y la transparencia en los procesos de la organización.</w:t>
+      </w:r>
+    </w:p>
+    <w:p>
+      <w:pPr>
+        <w:pStyle w:val="Textbody"/>
+        <w:rPr>
+          <w:rFonts w:ascii="Times New Roman" w:eastAsia="Times New Roman" w:hAnsi="Times New Roman" w:cs="Times New Roman"/>
+          <w:kern w:val="0"/>
+          <w:szCs w:val="22"/>
+          <w:lang w:val="es-CO"/>
+        </w:rPr>
+      </w:pPr>
+      <w:r>
+        <w:rPr>
+          <w:rFonts w:ascii="Times New Roman" w:eastAsia="Times New Roman" w:hAnsi="Times New Roman" w:cs="Times New Roman"/>
+          <w:kern w:val="0"/>
+          <w:szCs w:val="22"/>
+          <w:lang w:val="es-CO"/>
+        </w:rPr>
+        <w:t xml:space="preserve">Se tomará mayor énfasis en el área de Rectoría, ya que de allí se desprende la iniciativa que se acogerá como proyecto, relacionada con propuestas de innovación educativa que buscan métodos de estudio </w:t>
+      </w:r>
+      <w:proofErr w:type="spellStart"/>
+      <w:r>
+        <w:rPr>
+          <w:rFonts w:ascii="Times New Roman" w:eastAsia="Times New Roman" w:hAnsi="Times New Roman" w:cs="Times New Roman"/>
+          <w:kern w:val="0"/>
+          <w:szCs w:val="22"/>
+          <w:lang w:val="es-CO"/>
+        </w:rPr>
+        <w:t>neurodiversos</w:t>
+      </w:r>
+      <w:proofErr w:type="spellEnd"/>
+      <w:r>
+        <w:rPr>
+          <w:rFonts w:ascii="Times New Roman" w:eastAsia="Times New Roman" w:hAnsi="Times New Roman" w:cs="Times New Roman"/>
+          <w:kern w:val="0"/>
+          <w:szCs w:val="22"/>
+          <w:lang w:val="es-CO"/>
+        </w:rPr>
+        <w:t xml:space="preserve"> como el </w:t>
+      </w:r>
+      <w:proofErr w:type="spellStart"/>
+      <w:r>
+        <w:rPr>
+          <w:rFonts w:ascii="Times New Roman" w:eastAsia="Times New Roman" w:hAnsi="Times New Roman" w:cs="Times New Roman"/>
+          <w:kern w:val="0"/>
+          <w:szCs w:val="22"/>
+          <w:lang w:val="es-CO"/>
+        </w:rPr>
+        <w:t>game-based</w:t>
+      </w:r>
+      <w:proofErr w:type="spellEnd"/>
+      <w:r>
+        <w:rPr>
+          <w:rFonts w:ascii="Times New Roman" w:eastAsia="Times New Roman" w:hAnsi="Times New Roman" w:cs="Times New Roman"/>
+          <w:kern w:val="0"/>
+          <w:szCs w:val="22"/>
+          <w:lang w:val="es-CO"/>
+        </w:rPr>
+        <w:t xml:space="preserve"> </w:t>
+      </w:r>
+      <w:proofErr w:type="spellStart"/>
+      <w:r>
+        <w:rPr>
+          <w:rFonts w:ascii="Times New Roman" w:eastAsia="Times New Roman" w:hAnsi="Times New Roman" w:cs="Times New Roman"/>
+          <w:kern w:val="0"/>
+          <w:szCs w:val="22"/>
+          <w:lang w:val="es-CO"/>
+        </w:rPr>
+        <w:t>learning</w:t>
+      </w:r>
+      <w:proofErr w:type="spellEnd"/>
+      <w:r>
+        <w:rPr>
+          <w:rFonts w:ascii="Times New Roman" w:eastAsia="Times New Roman" w:hAnsi="Times New Roman" w:cs="Times New Roman"/>
+          <w:kern w:val="0"/>
+          <w:szCs w:val="22"/>
+          <w:lang w:val="es-CO"/>
+        </w:rPr>
+        <w:t xml:space="preserve">, de donde surge la idea de Next </w:t>
+      </w:r>
+      <w:proofErr w:type="spellStart"/>
+      <w:r>
+        <w:rPr>
+          <w:rFonts w:ascii="Times New Roman" w:eastAsia="Times New Roman" w:hAnsi="Times New Roman" w:cs="Times New Roman"/>
+          <w:kern w:val="0"/>
+          <w:szCs w:val="22"/>
+          <w:lang w:val="es-CO"/>
+        </w:rPr>
+        <w:t>Level</w:t>
+      </w:r>
+      <w:proofErr w:type="spellEnd"/>
+      <w:r>
+        <w:rPr>
+          <w:rFonts w:ascii="Times New Roman" w:eastAsia="Times New Roman" w:hAnsi="Times New Roman" w:cs="Times New Roman"/>
+          <w:kern w:val="0"/>
+          <w:szCs w:val="22"/>
+          <w:lang w:val="es-CO"/>
+        </w:rPr>
+        <w:t xml:space="preserve"> como un “Laboratorio de Videojuegos”.</w:t>
+      </w:r>
+    </w:p>
+    <w:p>
+      <w:pPr>
+        <w:pStyle w:val="Textbody"/>
+        <w:rPr>
+          <w:rFonts w:ascii="Times New Roman" w:eastAsia="Times New Roman" w:hAnsi="Times New Roman" w:cs="Times New Roman"/>
+          <w:kern w:val="0"/>
+          <w:szCs w:val="22"/>
+          <w:lang w:val="es-CO"/>
+        </w:rPr>
+      </w:pPr>
+      <w:r>
+        <w:rPr>
+          <w:rFonts w:ascii="Times New Roman" w:eastAsia="Times New Roman" w:hAnsi="Times New Roman" w:cs="Times New Roman"/>
+          <w:kern w:val="0"/>
+          <w:szCs w:val="22"/>
+          <w:lang w:val="es-CO"/>
+        </w:rPr>
+        <w:t xml:space="preserve">El </w:t>
+      </w:r>
+      <w:proofErr w:type="spellStart"/>
+      <w:r>
+        <w:rPr>
+          <w:rFonts w:ascii="Times New Roman" w:eastAsia="Times New Roman" w:hAnsi="Times New Roman" w:cs="Times New Roman"/>
+          <w:kern w:val="0"/>
+          <w:szCs w:val="22"/>
+          <w:lang w:val="es-CO"/>
+        </w:rPr>
+        <w:t>Tdea</w:t>
+      </w:r>
+      <w:proofErr w:type="spellEnd"/>
+      <w:r>
+        <w:rPr>
+          <w:rFonts w:ascii="Times New Roman" w:eastAsia="Times New Roman" w:hAnsi="Times New Roman" w:cs="Times New Roman"/>
+          <w:kern w:val="0"/>
+          <w:szCs w:val="22"/>
+          <w:lang w:val="es-CO"/>
+        </w:rPr>
+        <w:t xml:space="preserve"> también cuenta con una variedad de facultades las cuales son consideradas el eje estructural y el "corazón académico" que impulsa la formación integral, la innovación y el compromiso social. La institución cuenta con las siguientes facultades:</w:t>
       </w:r>
     </w:p>
     <w:p>
@@ -6156,16 +5997,36 @@
           <w:szCs w:val="22"/>
           <w:lang w:val="es-CO"/>
         </w:rPr>
-        <w:t>Facultad de Derecho y Ciencias Forenses:</w:t>
-      </w:r>
-      <w:r>
-        <w:rPr>
-          <w:rFonts w:ascii="Times New Roman" w:eastAsia="Times New Roman" w:hAnsi="Times New Roman" w:cs="Times New Roman"/>
-          <w:kern w:val="0"/>
-          <w:szCs w:val="22"/>
-          <w:lang w:val="es-CO"/>
-        </w:rPr>
-        <w:t xml:space="preserve"> Destaca por su "alto impacto social e inclusión", especialmente a través de su Consultorio Jurídico y Centro de Conciliación, que ofrece servicios priorizados a mujeres, personas con discapacidad y diversidad de género.</w:t>
+        <w:t>Facultad de Ciencias Administrativas y Económicas:</w:t>
+      </w:r>
+      <w:r>
+        <w:rPr>
+          <w:rFonts w:ascii="Times New Roman" w:eastAsia="Times New Roman" w:hAnsi="Times New Roman" w:cs="Times New Roman"/>
+          <w:kern w:val="0"/>
+          <w:szCs w:val="22"/>
+          <w:lang w:val="es-CO"/>
+        </w:rPr>
+        <w:t xml:space="preserve"> Se centra en formar profesionales con una "visión estratégica y gerencial</w:t>
+      </w:r>
+      <w:proofErr w:type="gramStart"/>
+      <w:r>
+        <w:rPr>
+          <w:rFonts w:ascii="Times New Roman" w:eastAsia="Times New Roman" w:hAnsi="Times New Roman" w:cs="Times New Roman"/>
+          <w:kern w:val="0"/>
+          <w:szCs w:val="22"/>
+          <w:lang w:val="es-CO"/>
+        </w:rPr>
+        <w:t>"  para</w:t>
+      </w:r>
+      <w:proofErr w:type="gramEnd"/>
+      <w:r>
+        <w:rPr>
+          <w:rFonts w:ascii="Times New Roman" w:eastAsia="Times New Roman" w:hAnsi="Times New Roman" w:cs="Times New Roman"/>
+          <w:kern w:val="0"/>
+          <w:szCs w:val="22"/>
+          <w:lang w:val="es-CO"/>
+        </w:rPr>
+        <w:t xml:space="preserve"> la gestión eficiente de organizaciones y cadenas de suministro.</w:t>
       </w:r>
     </w:p>
     <w:p>
@@ -6191,16 +6052,16 @@
           <w:szCs w:val="22"/>
           <w:lang w:val="es-CO"/>
         </w:rPr>
-        <w:t>Facultad de Educación y Ciencias Sociales:</w:t>
-      </w:r>
-      <w:r>
-        <w:rPr>
-          <w:rFonts w:ascii="Times New Roman" w:eastAsia="Times New Roman" w:hAnsi="Times New Roman" w:cs="Times New Roman"/>
-          <w:kern w:val="0"/>
-          <w:szCs w:val="22"/>
-          <w:lang w:val="es-CO"/>
-        </w:rPr>
-        <w:t xml:space="preserve"> Enfocada en la formación humana y el desarrollo social, ofrece programas de alto nivel como el "Doctorado en Educación y Estudios Sociales" y maestrías en pedagogía digital.</w:t>
+        <w:t>Facultad de Derecho y Ciencias Forenses:</w:t>
+      </w:r>
+      <w:r>
+        <w:rPr>
+          <w:rFonts w:ascii="Times New Roman" w:eastAsia="Times New Roman" w:hAnsi="Times New Roman" w:cs="Times New Roman"/>
+          <w:kern w:val="0"/>
+          <w:szCs w:val="22"/>
+          <w:lang w:val="es-CO"/>
+        </w:rPr>
+        <w:t xml:space="preserve"> Destaca por su "alto impacto social e inclusión", especialmente a través de su Consultorio Jurídico y Centro de Conciliación, que ofrece servicios priorizados a mujeres, personas con discapacidad y diversidad de género.</w:t>
       </w:r>
     </w:p>
     <w:p>
@@ -6226,17 +6087,26 @@
           <w:szCs w:val="22"/>
           <w:lang w:val="es-CO"/>
         </w:rPr>
+        <w:t xml:space="preserve">Facultad de Ingeniería: </w:t>
+      </w:r>
+      <w:r>
+        <w:rPr>
+          <w:rFonts w:ascii="Times New Roman" w:eastAsia="Times New Roman" w:hAnsi="Times New Roman" w:cs="Times New Roman"/>
+          <w:kern w:val="0"/>
+          <w:szCs w:val="22"/>
+          <w:lang w:val="es-CO"/>
+        </w:rPr>
+        <w:t xml:space="preserve">Se dedica a ofrecer programas académicos innovadores orientados a la formación profesional para la "transformación del futuro". Incluye áreas especializadas </w:t>
+      </w:r>
+      <w:r>
+        <w:rPr>
+          <w:rFonts w:ascii="Times New Roman" w:eastAsia="Times New Roman" w:hAnsi="Times New Roman" w:cs="Times New Roman"/>
+          <w:kern w:val="0"/>
+          <w:szCs w:val="22"/>
+          <w:lang w:val="es-CO"/>
+        </w:rPr>
         <w:lastRenderedPageBreak/>
-        <w:t xml:space="preserve">Facultad de Ingeniería: </w:t>
-      </w:r>
-      <w:r>
-        <w:rPr>
-          <w:rFonts w:ascii="Times New Roman" w:eastAsia="Times New Roman" w:hAnsi="Times New Roman" w:cs="Times New Roman"/>
-          <w:kern w:val="0"/>
-          <w:szCs w:val="22"/>
-          <w:lang w:val="es-CO"/>
-        </w:rPr>
-        <w:t>Se dedica a ofrecer programas académicos innovadores orientados a la formación profesional para la "transformación del futuro". Incluye áreas especializadas como la Gestión de Tecnología de la Información.</w:t>
+        <w:t>como la Gestión de Tecnología de la Información.</w:t>
       </w:r>
     </w:p>
     <w:p>
@@ -6522,7 +6392,27 @@
           <w:szCs w:val="22"/>
           <w:lang w:val="es-CO"/>
         </w:rPr>
-        <w:t xml:space="preserve"> Virtual  (https://virtual.tdea.edu.co)</w:t>
+        <w:t xml:space="preserve"> </w:t>
+      </w:r>
+      <w:proofErr w:type="gramStart"/>
+      <w:r>
+        <w:rPr>
+          <w:rFonts w:ascii="Times New Roman" w:eastAsia="Times New Roman" w:hAnsi="Times New Roman" w:cs="Times New Roman"/>
+          <w:kern w:val="0"/>
+          <w:szCs w:val="22"/>
+          <w:lang w:val="es-CO"/>
+        </w:rPr>
+        <w:t>Virtual  (</w:t>
+      </w:r>
+      <w:proofErr w:type="gramEnd"/>
+      <w:r>
+        <w:rPr>
+          <w:rFonts w:ascii="Times New Roman" w:eastAsia="Times New Roman" w:hAnsi="Times New Roman" w:cs="Times New Roman"/>
+          <w:kern w:val="0"/>
+          <w:szCs w:val="22"/>
+          <w:lang w:val="es-CO"/>
+        </w:rPr>
+        <w:t>https://virtual.tdea.edu.co)</w:t>
       </w:r>
     </w:p>
     <w:p>
@@ -7044,11 +6934,11 @@
               </w:rPr>
             </w:pPr>
             <w:r>
-              <w:t>https://www.capterra.com/p/132372/Skedda-</w:t>
+              <w:t>https://www.capterra.com/p/132372/Skedda-Bookings/?utm_sour</w:t>
             </w:r>
             <w:r>
               <w:lastRenderedPageBreak/>
-              <w:t>Bookings/?utm_source</w:t>
+              <w:t>ce</w:t>
             </w:r>
           </w:p>
         </w:tc>
@@ -7068,15 +6958,15 @@
             </w:pPr>
             <w:r>
               <w:lastRenderedPageBreak/>
-              <w:t xml:space="preserve">• Sistema fuerte para reservas de espacios y recursos con reglas </w:t>
+              <w:t xml:space="preserve">• Sistema fuerte para reservas de espacios y recursos con reglas personalizadas. </w:t>
+            </w:r>
+            <w:r>
+              <w:br/>
+              <w:t xml:space="preserve">• Interfaz fácil de usar e </w:t>
             </w:r>
             <w:r>
               <w:lastRenderedPageBreak/>
-              <w:t xml:space="preserve">personalizadas. </w:t>
-            </w:r>
-            <w:r>
-              <w:br/>
-              <w:t>• Interfaz fácil de usar e integrado con calendarios profesionales.</w:t>
+              <w:t>integrado con calendarios profesionales.</w:t>
             </w:r>
           </w:p>
         </w:tc>
@@ -7096,15 +6986,15 @@
             </w:pPr>
             <w:r>
               <w:lastRenderedPageBreak/>
-              <w:t xml:space="preserve">• Costoso para pequeños negocios o proyectos estudiantiles (planes desde </w:t>
+              <w:t xml:space="preserve">• Costoso para pequeños negocios o proyectos estudiantiles (planes desde ~$99/mes). </w:t>
+            </w:r>
+            <w:r>
+              <w:br/>
+              <w:t xml:space="preserve">• Algunas funciones avanzadas </w:t>
             </w:r>
             <w:r>
               <w:lastRenderedPageBreak/>
-              <w:t xml:space="preserve">~$99/mes). </w:t>
-            </w:r>
-            <w:r>
-              <w:br/>
-              <w:t>• Algunas funciones avanzadas (pagos o customización profunda) pueden faltar.</w:t>
+              <w:t>(pagos o customización profunda) pueden faltar.</w:t>
             </w:r>
           </w:p>
         </w:tc>
@@ -7909,7 +7799,15 @@
         <w:t xml:space="preserve"> TDEA</w:t>
       </w:r>
       <w:r>
-        <w:t xml:space="preserve"> planea ser la mejor solución a todos estos problemas ya que integra en una sola plataforma todos los procesos clave del laboratorio. En lugar de depender de registros independientes o controles informales, el software nos permitirá automatizar la asignación de turnos y controlar de manera precisa el tiempo de uso de cada equipo. Esto significa que si un equipo presenta una falla, el sistema dejará constancia inmediatamente, permitiendo programar su mantenimiento sin afectar la organización general del laboratorio ni ningún tipo de espacio ya reservado. De esta manera, cuidamos los equipos y prolongamos su vida útil. </w:t>
+        <w:t xml:space="preserve"> planea ser la mejor solución a todos estos problemas ya que integra en una sola plataforma todos los procesos clave del laboratorio. En lugar de depender de registros independientes o controles informales, el software nos permitirá automatizar la asignación de turnos y controlar de manera precisa el tiempo de uso de cada equipo. Esto significa </w:t>
+      </w:r>
+      <w:proofErr w:type="gramStart"/>
+      <w:r>
+        <w:t>que</w:t>
+      </w:r>
+      <w:proofErr w:type="gramEnd"/>
+      <w:r>
+        <w:t xml:space="preserve"> si un equipo presenta una falla, el sistema dejará constancia inmediatamente, permitiendo programar su mantenimiento sin afectar la organización general del laboratorio ni ningún tipo de espacio ya reservado. De esta manera, cuidamos los equipos y prolongamos su vida útil. </w:t>
       </w:r>
     </w:p>
     <w:p>
@@ -8919,14 +8817,30 @@
           <w:rFonts w:ascii="NewsGotT" w:hAnsi="NewsGotT"/>
           <w:sz w:val="22"/>
         </w:rPr>
-        <w:t xml:space="preserve"> haciendo análisis de los requisitos de todos los frentes involucrados </w:t>
-      </w:r>
+        <w:t xml:space="preserve"> haciendo análisis de los requisitos de todos los frentes </w:t>
+      </w:r>
+      <w:proofErr w:type="gramStart"/>
       <w:r>
         <w:rPr>
           <w:rFonts w:ascii="NewsGotT" w:hAnsi="NewsGotT"/>
           <w:sz w:val="22"/>
         </w:rPr>
-        <w:t>, para con esto trazar un plan de acción con objetivos, funcionalidades, alcances y etapas a conseguir para el producto final.</w:t>
+        <w:t xml:space="preserve">involucrados </w:t>
+      </w:r>
+      <w:r>
+        <w:rPr>
+          <w:rFonts w:ascii="NewsGotT" w:hAnsi="NewsGotT"/>
+          <w:sz w:val="22"/>
+        </w:rPr>
+        <w:t>,</w:t>
+      </w:r>
+      <w:proofErr w:type="gramEnd"/>
+      <w:r>
+        <w:rPr>
+          <w:rFonts w:ascii="NewsGotT" w:hAnsi="NewsGotT"/>
+          <w:sz w:val="22"/>
+        </w:rPr>
+        <w:t xml:space="preserve"> para con esto trazar un plan de acción con objetivos, funcionalidades, alcances y etapas a conseguir para el producto final.</w:t>
       </w:r>
     </w:p>
     <w:p>
@@ -9028,6 +8942,7 @@
         </w:rPr>
         <w:t xml:space="preserve"> afines, y su integración </w:t>
       </w:r>
+      <w:proofErr w:type="gramStart"/>
       <w:r>
         <w:rPr>
           <w:rFonts w:ascii="NewsGotT" w:hAnsi="NewsGotT"/>
@@ -9044,6 +8959,7 @@
         <w:t>APIs</w:t>
       </w:r>
       <w:proofErr w:type="spellEnd"/>
+      <w:proofErr w:type="gramEnd"/>
       <w:r>
         <w:rPr>
           <w:rFonts w:ascii="NewsGotT" w:hAnsi="NewsGotT"/>
@@ -9409,7 +9325,15 @@
         <w:pStyle w:val="Textbody"/>
       </w:pPr>
       <w:r>
-        <w:t xml:space="preserve">Campus Universitario Robledo (Sede Principal): Se ubica en la Calle 78B No. 72A – 220, en la ciudad de Medellín, Colombia. Por otro lado el </w:t>
+        <w:t xml:space="preserve">Campus Universitario Robledo (Sede Principal): Se ubica en la Calle 78B No. 72A – 220, en la ciudad de Medellín, Colombia. Por otro </w:t>
+      </w:r>
+      <w:proofErr w:type="gramStart"/>
+      <w:r>
+        <w:t>lado</w:t>
+      </w:r>
+      <w:proofErr w:type="gramEnd"/>
+      <w:r>
+        <w:t xml:space="preserve"> el </w:t>
       </w:r>
       <w:proofErr w:type="spellStart"/>
       <w:r>
@@ -9545,6 +9469,289 @@
       <w:pPr>
         <w:pStyle w:val="Textbody"/>
       </w:pPr>
+      <w:r>
+        <w:t>Actualmente las áreas principales que conforman la organización son</w:t>
+      </w:r>
+      <w:r>
+        <w:t>:</w:t>
+      </w:r>
+    </w:p>
+    <w:p>
+      <w:pPr>
+        <w:pStyle w:val="Textbody"/>
+        <w:rPr>
+          <w:b/>
+          <w:bCs/>
+        </w:rPr>
+      </w:pPr>
+      <w:r>
+        <w:rPr>
+          <w:b/>
+          <w:bCs/>
+        </w:rPr>
+        <w:t>Rectoría</w:t>
+      </w:r>
+      <w:r>
+        <w:rPr>
+          <w:b/>
+          <w:bCs/>
+        </w:rPr>
+        <w:t>:</w:t>
+      </w:r>
+    </w:p>
+    <w:p>
+      <w:pPr>
+        <w:pStyle w:val="Textbody"/>
+      </w:pPr>
+      <w:r>
+        <w:t>La gestión administrativa y financiera del Tecnológico de Antioquia concibe procesos encaminados a favorecer el cumplimiento de las funciones institucionales de: docencia, investigación y extensión, en los términos planteados en el PEI y en el plan de Desarrollo Institucional. Para este efecto, se cuenta con una estructura administrativo-financiera y mecanismos de gestión, orientados al fomento del desarrollo académico y académico-administrativo.</w:t>
+      </w:r>
+      <w:r>
+        <w:t xml:space="preserve"> </w:t>
+      </w:r>
+    </w:p>
+    <w:p>
+      <w:pPr>
+        <w:pStyle w:val="Textbody"/>
+      </w:pPr>
+      <w:r>
+        <w:t xml:space="preserve">Para la creación de la iniciativa </w:t>
+      </w:r>
+      <w:r>
+        <w:rPr>
+          <w:b/>
+          <w:bCs/>
+        </w:rPr>
+        <w:t xml:space="preserve">Next </w:t>
+      </w:r>
+      <w:proofErr w:type="spellStart"/>
+      <w:r>
+        <w:rPr>
+          <w:b/>
+          <w:bCs/>
+        </w:rPr>
+        <w:t>Level</w:t>
+      </w:r>
+      <w:proofErr w:type="spellEnd"/>
+      <w:r>
+        <w:rPr>
+          <w:b/>
+          <w:bCs/>
+        </w:rPr>
+        <w:t xml:space="preserve"> </w:t>
+      </w:r>
+      <w:r>
+        <w:t>se tiene en cuenta un área adicional, llamada:</w:t>
+      </w:r>
+    </w:p>
+    <w:p>
+      <w:pPr>
+        <w:pStyle w:val="NormalWeb"/>
+        <w:rPr>
+          <w:sz w:val="22"/>
+          <w:szCs w:val="22"/>
+        </w:rPr>
+      </w:pPr>
+      <w:r>
+        <w:rPr>
+          <w:rStyle w:val="Strong"/>
+          <w:sz w:val="22"/>
+          <w:szCs w:val="22"/>
+        </w:rPr>
+        <w:t>Innovación:</w:t>
+      </w:r>
+      <w:r>
+        <w:rPr>
+          <w:sz w:val="22"/>
+          <w:szCs w:val="22"/>
+        </w:rPr>
+        <w:br/>
+        <w:t xml:space="preserve">Área encargada de gestionar y ejecutar los procesos administrativos asociados a iniciativas estratégicas, alineadas con el plan institucional definido por la rectoría y el consejo directivo. Su propósito es </w:t>
+      </w:r>
+      <w:r>
+        <w:rPr>
+          <w:sz w:val="22"/>
+          <w:szCs w:val="22"/>
+        </w:rPr>
+        <w:lastRenderedPageBreak/>
+        <w:t>impulsar, estructurar y posicionar nuevas ideas dentro del entorno institucional, promoviendo el desarrollo y la mejora continua.</w:t>
+      </w:r>
+    </w:p>
+    <w:p>
+      <w:pPr>
+        <w:pStyle w:val="NormalWeb"/>
+        <w:rPr>
+          <w:sz w:val="22"/>
+          <w:szCs w:val="22"/>
+        </w:rPr>
+      </w:pPr>
+      <w:r>
+        <w:rPr>
+          <w:rStyle w:val="Strong"/>
+          <w:sz w:val="22"/>
+          <w:szCs w:val="22"/>
+        </w:rPr>
+        <w:t xml:space="preserve">Iniciativa – Métodos de educación </w:t>
+      </w:r>
+      <w:proofErr w:type="spellStart"/>
+      <w:r>
+        <w:rPr>
+          <w:rStyle w:val="Strong"/>
+          <w:sz w:val="22"/>
+          <w:szCs w:val="22"/>
+        </w:rPr>
+        <w:t>neurodiversos</w:t>
+      </w:r>
+      <w:proofErr w:type="spellEnd"/>
+      <w:r>
+        <w:rPr>
+          <w:rStyle w:val="Strong"/>
+          <w:sz w:val="22"/>
+          <w:szCs w:val="22"/>
+        </w:rPr>
+        <w:t>:</w:t>
+      </w:r>
+      <w:r>
+        <w:rPr>
+          <w:sz w:val="22"/>
+          <w:szCs w:val="22"/>
+        </w:rPr>
+        <w:br/>
+        <w:t xml:space="preserve">Dentro del área de innovación surge una iniciativa enfocada en el desarrollo e implementación de métodos de educación </w:t>
+      </w:r>
+      <w:proofErr w:type="spellStart"/>
+      <w:r>
+        <w:rPr>
+          <w:sz w:val="22"/>
+          <w:szCs w:val="22"/>
+        </w:rPr>
+        <w:t>neurodiversos</w:t>
+      </w:r>
+      <w:proofErr w:type="spellEnd"/>
+      <w:r>
+        <w:rPr>
+          <w:sz w:val="22"/>
+          <w:szCs w:val="22"/>
+        </w:rPr>
+        <w:t>, orientados a responder a las diferentes formas de aprendizaje de las nuevas generaciones.</w:t>
+      </w:r>
+    </w:p>
+    <w:p>
+      <w:pPr>
+        <w:pStyle w:val="NormalWeb"/>
+        <w:rPr>
+          <w:sz w:val="22"/>
+          <w:szCs w:val="22"/>
+        </w:rPr>
+      </w:pPr>
+      <w:r>
+        <w:rPr>
+          <w:sz w:val="22"/>
+          <w:szCs w:val="22"/>
+        </w:rPr>
+        <w:t xml:space="preserve">Como parte de esta iniciativa, se integra el enfoque </w:t>
+      </w:r>
+      <w:proofErr w:type="spellStart"/>
+      <w:r>
+        <w:rPr>
+          <w:rStyle w:val="Strong"/>
+          <w:sz w:val="22"/>
+          <w:szCs w:val="22"/>
+        </w:rPr>
+        <w:t>Game-Based</w:t>
+      </w:r>
+      <w:proofErr w:type="spellEnd"/>
+      <w:r>
+        <w:rPr>
+          <w:rStyle w:val="Strong"/>
+          <w:sz w:val="22"/>
+          <w:szCs w:val="22"/>
+        </w:rPr>
+        <w:t xml:space="preserve"> </w:t>
+      </w:r>
+      <w:proofErr w:type="spellStart"/>
+      <w:r>
+        <w:rPr>
+          <w:rStyle w:val="Strong"/>
+          <w:sz w:val="22"/>
+          <w:szCs w:val="22"/>
+        </w:rPr>
+        <w:t>Learning</w:t>
+      </w:r>
+      <w:proofErr w:type="spellEnd"/>
+      <w:r>
+        <w:rPr>
+          <w:rStyle w:val="Strong"/>
+          <w:sz w:val="22"/>
+          <w:szCs w:val="22"/>
+        </w:rPr>
+        <w:t xml:space="preserve"> (aprendizaje basado en juegos)</w:t>
+      </w:r>
+      <w:r>
+        <w:rPr>
+          <w:sz w:val="22"/>
+          <w:szCs w:val="22"/>
+        </w:rPr>
+        <w:t xml:space="preserve">, el cual da origen al laboratorio de juegos </w:t>
+      </w:r>
+      <w:r>
+        <w:rPr>
+          <w:rStyle w:val="Strong"/>
+          <w:sz w:val="22"/>
+          <w:szCs w:val="22"/>
+        </w:rPr>
+        <w:t xml:space="preserve">“Next </w:t>
+      </w:r>
+      <w:proofErr w:type="spellStart"/>
+      <w:r>
+        <w:rPr>
+          <w:rStyle w:val="Strong"/>
+          <w:sz w:val="22"/>
+          <w:szCs w:val="22"/>
+        </w:rPr>
+        <w:t>Level</w:t>
+      </w:r>
+      <w:proofErr w:type="spellEnd"/>
+      <w:r>
+        <w:rPr>
+          <w:rStyle w:val="Strong"/>
+          <w:sz w:val="22"/>
+          <w:szCs w:val="22"/>
+        </w:rPr>
+        <w:t>”</w:t>
+      </w:r>
+      <w:r>
+        <w:rPr>
+          <w:sz w:val="22"/>
+          <w:szCs w:val="22"/>
+        </w:rPr>
+        <w:t>.</w:t>
+      </w:r>
+    </w:p>
+    <w:p>
+      <w:pPr>
+        <w:pStyle w:val="NormalWeb"/>
+        <w:rPr>
+          <w:sz w:val="22"/>
+          <w:szCs w:val="22"/>
+        </w:rPr>
+      </w:pPr>
+      <w:r>
+        <w:rPr>
+          <w:rStyle w:val="Strong"/>
+          <w:sz w:val="22"/>
+          <w:szCs w:val="22"/>
+        </w:rPr>
+        <w:t>Facultad de Educación y Ciencias Sociales:</w:t>
+      </w:r>
+      <w:r>
+        <w:rPr>
+          <w:sz w:val="22"/>
+          <w:szCs w:val="22"/>
+        </w:rPr>
+        <w:br/>
+        <w:t>Facultad responsable de la administración y gestión integral del laboratorio de juegos, ejerciendo dominio sobre el espacio y sus dinámicas de funcionamiento. Es la encargada de liderar el desarrollo de la iniciativa, donde la propuesta comienza a materializarse y dar resultados. Este entorno es utilizado para explorar, implementar y evaluar el impacto de metodologías innovadoras en los procesos de aprendizaje.</w:t>
+      </w:r>
     </w:p>
     <w:p>
       <w:pPr>
@@ -11715,7 +11922,7 @@
       <w:lvlText w:val="-"/>
       <w:lvlJc w:val="left"/>
       <w:pPr>
-        <w:ind w:left="360" w:hanging="360"/>
+        <w:ind w:left="1069" w:hanging="360"/>
       </w:pPr>
       <w:rPr>
         <w:rFonts w:ascii="Times New Roman" w:eastAsia="Times New Roman" w:hAnsi="Times New Roman" w:cs="Times New Roman" w:hint="default"/>
@@ -11728,7 +11935,7 @@
       <w:lvlText w:val="o"/>
       <w:lvlJc w:val="left"/>
       <w:pPr>
-        <w:ind w:left="1080" w:hanging="360"/>
+        <w:ind w:left="1789" w:hanging="360"/>
       </w:pPr>
       <w:rPr>
         <w:rFonts w:ascii="Courier New" w:hAnsi="Courier New" w:cs="Courier New" w:hint="default"/>
@@ -11740,7 +11947,7 @@
       <w:lvlText w:val=""/>
       <w:lvlJc w:val="left"/>
       <w:pPr>
-        <w:ind w:left="1800" w:hanging="360"/>
+        <w:ind w:left="2509" w:hanging="360"/>
       </w:pPr>
       <w:rPr>
         <w:rFonts w:ascii="Wingdings" w:hAnsi="Wingdings" w:hint="default"/>
@@ -11752,7 +11959,7 @@
       <w:lvlText w:val=""/>
       <w:lvlJc w:val="left"/>
       <w:pPr>
-        <w:ind w:left="2520" w:hanging="360"/>
+        <w:ind w:left="3229" w:hanging="360"/>
       </w:pPr>
       <w:rPr>
         <w:rFonts w:ascii="Symbol" w:hAnsi="Symbol" w:hint="default"/>
@@ -11764,7 +11971,7 @@
       <w:lvlText w:val="o"/>
       <w:lvlJc w:val="left"/>
       <w:pPr>
-        <w:ind w:left="3240" w:hanging="360"/>
+        <w:ind w:left="3949" w:hanging="360"/>
       </w:pPr>
       <w:rPr>
         <w:rFonts w:ascii="Courier New" w:hAnsi="Courier New" w:cs="Courier New" w:hint="default"/>
@@ -11776,7 +11983,7 @@
       <w:lvlText w:val=""/>
       <w:lvlJc w:val="left"/>
       <w:pPr>
-        <w:ind w:left="3960" w:hanging="360"/>
+        <w:ind w:left="4669" w:hanging="360"/>
       </w:pPr>
       <w:rPr>
         <w:rFonts w:ascii="Wingdings" w:hAnsi="Wingdings" w:hint="default"/>
@@ -11788,7 +11995,7 @@
       <w:lvlText w:val=""/>
       <w:lvlJc w:val="left"/>
       <w:pPr>
-        <w:ind w:left="4680" w:hanging="360"/>
+        <w:ind w:left="5389" w:hanging="360"/>
       </w:pPr>
       <w:rPr>
         <w:rFonts w:ascii="Symbol" w:hAnsi="Symbol" w:hint="default"/>
@@ -11800,7 +12007,7 @@
       <w:lvlText w:val="o"/>
       <w:lvlJc w:val="left"/>
       <w:pPr>
-        <w:ind w:left="5400" w:hanging="360"/>
+        <w:ind w:left="6109" w:hanging="360"/>
       </w:pPr>
       <w:rPr>
         <w:rFonts w:ascii="Courier New" w:hAnsi="Courier New" w:cs="Courier New" w:hint="default"/>
@@ -11812,7 +12019,7 @@
       <w:lvlText w:val=""/>
       <w:lvlJc w:val="left"/>
       <w:pPr>
-        <w:ind w:left="6120" w:hanging="360"/>
+        <w:ind w:left="6829" w:hanging="360"/>
       </w:pPr>
       <w:rPr>
         <w:rFonts w:ascii="Wingdings" w:hAnsi="Wingdings" w:hint="default"/>
@@ -12181,6 +12388,7 @@
     <w:lsdException w:name="HTML Sample" w:semiHidden="1" w:unhideWhenUsed="1"/>
     <w:lsdException w:name="HTML Typewriter" w:semiHidden="1" w:unhideWhenUsed="1"/>
     <w:lsdException w:name="HTML Variable" w:semiHidden="1" w:unhideWhenUsed="1"/>
+    <w:lsdException w:name="Normal Table" w:semiHidden="1" w:unhideWhenUsed="1"/>
     <w:lsdException w:name="annotation subject" w:semiHidden="1" w:unhideWhenUsed="1"/>
     <w:lsdException w:name="No List" w:semiHidden="1" w:unhideWhenUsed="1"/>
     <w:lsdException w:name="Outline List 1" w:semiHidden="1" w:unhideWhenUsed="1"/>
@@ -12227,8 +12435,10 @@
     <w:lsdException w:name="Table Subtle 2" w:semiHidden="1" w:unhideWhenUsed="1"/>
     <w:lsdException w:name="Table Web 1" w:semiHidden="1" w:unhideWhenUsed="1"/>
     <w:lsdException w:name="Table Web 2" w:semiHidden="1" w:unhideWhenUsed="1"/>
+    <w:lsdException w:name="Table Web 3" w:semiHidden="1" w:unhideWhenUsed="1"/>
     <w:lsdException w:name="Balloon Text" w:semiHidden="1" w:unhideWhenUsed="1"/>
     <w:lsdException w:name="Table Grid" w:uiPriority="39"/>
+    <w:lsdException w:name="Table Theme" w:semiHidden="1" w:unhideWhenUsed="1"/>
     <w:lsdException w:name="Placeholder Text" w:semiHidden="1"/>
     <w:lsdException w:name="No Spacing" w:uiPriority="1" w:qFormat="1"/>
     <w:lsdException w:name="Light Shading" w:uiPriority="60"/>

</xml_diff>